<commit_message>
feat: escena Intermedio, nivel intermedio definitivo y APK en el repositorio
- Intermedio generada desde Basico: narrador en la lista 2, módulos *_Intermedia,
  nivel intermedio del escenario 1 y fila del escenario 3 editable
- escenario1_intermedio.json: diseño definitivo, simétrico; la solución por arriba es de
  11 bloques y el camino de abajo (14) no cabe en la fila. Herramienta 3 con 11 huecos y
  paleta de 13
- Tools → Codea → 3: convierte una copia de Basico a dificultad intermedia
- Telemetría: StartChallenge es idempotente y los retos 2–4 se abren al llegar a la sala,
  antes de la narración; en las pruebas 0101/0102 el primer intento del escenario 3 quedaba
  antes de su inicio y un agarre del escenario 4 se contaba en el 3
- Build: solo se versiona app.apk (Git LFS); el resto de la carpeta sale del repositorio
- Muestras de telemetría 0101 y 0102; Context y GDD actualizados
</commit_message>
<xml_diff>
--- a/Docs/Codea2_GDD.docx
+++ b/Docs/Codea2_GDD.docx
@@ -4103,7 +4103,7 @@
           </w:tcPr>
           <w:p>
             <w:r>
-              <w:t xml:space="preserve">7 × 5</w:t>
+              <w:t xml:space="preserve">6 × 5 (misma sala)</w:t>
             </w:r>
           </w:p>
         </w:tc>
@@ -4171,7 +4171,7 @@
           </w:tcPr>
           <w:p>
             <w:r>
-              <w:t xml:space="preserve">9 bloques</w:t>
+              <w:t xml:space="preserve">11 bloques, por arriba</w:t>
             </w:r>
           </w:p>
         </w:tc>
@@ -4239,7 +4239,7 @@
           </w:tcPr>
           <w:p>
             <w:r>
-              <w:t xml:space="preserve">12, con 3 sobrantes</w:t>
+              <w:t xml:space="preserve">13: los de la solución y 2 de sobra</w:t>
             </w:r>
           </w:p>
         </w:tc>
@@ -4307,7 +4307,7 @@
           </w:tcPr>
           <w:p>
             <w:r>
-              <w:t xml:space="preserve">10</w:t>
+              <w:t xml:space="preserve">11</w:t>
             </w:r>
           </w:p>
         </w:tc>
@@ -4375,7 +4375,7 @@
           </w:tcPr>
           <w:p>
             <w:r>
-              <w:t xml:space="preserve">Roki empieza mirando a una pared: el primer paso es un giro. Hay casillas de peligro donde acaba cada tramo, para quien se pase</w:t>
+              <w:t xml:space="preserve">El botón solo se pulsa de frente. El tablero es simétrico: por abajo también se llega, pero hacen falta 14 bloques y la fila solo tiene 11. Hay que planificar el camino corto antes de colocar nada</w:t>
             </w:r>
           </w:p>
         </w:tc>
@@ -7080,7 +7080,7 @@
           </w:tcPr>
           <w:p>
             <w:r>
-              <w:t xml:space="preserve">9 de 12 bloques; empieza mirando a una pared; peligros al final de cada tramo</w:t>
+              <w:t xml:space="preserve">Camino de 11 bloques con 13 disponibles; el camino simétrico de abajo no cabe en la fila</w:t>
             </w:r>
           </w:p>
         </w:tc>

</xml_diff>

<commit_message>
docs: documentación y ejemplos JSON al formato nuevo de telemetría
- Context.md: telemetría, tutorial, herramientas 4-6 y estado al 06/10/2026
- VARIABLES_TELEMETRIA.md: variables nuevas y tabla de equivalencias con el
  formato anterior
- Plan de prueba y su JSON esperado rehechos para el formato nuevo
- ejemplo_run_telemetria.json y las dos muestras reales, convertidos; las
  muestras llevan estimados deviceId, blocksConnected y blockResets
- validar_json_telemetria.js: comprueba un JSON contra TelemetryData.cs
- GDD regenerado con el apartado de registro de datos al día
</commit_message>
<xml_diff>
--- a/Docs/Codea2_GDD.docx
+++ b/Docs/Codea2_GDD.docx
@@ -7303,7 +7303,7 @@
         <w:spacing w:after="120"/>
       </w:pPr>
       <w:r>
-        <w:t xml:space="preserve">Cada sesión genera un archivo JSON en el visor, nombrado con el PIN y un número de sesión. Se escribe durante la partida, de modo que un cierre inesperado no pierde lo ya registrado. Al terminar se intenta subir al servidor del proyecto; sin conexión, el archivo se queda en el visor.</w:t>
+        <w:t xml:space="preserve">Cada sesión genera un archivo JSON en el visor, nombrado con el PIN, un número de sesión y el código del visor. Se escribe durante la partida, de modo que un cierre inesperado no pierde lo ya registrado. Al terminar se intenta subir al servidor del proyecto; sin conexión, el archivo se queda en el visor.</w:t>
       </w:r>
     </w:p>
     <w:tbl>
@@ -7468,7 +7468,7 @@
           </w:tcPr>
           <w:p>
             <w:r>
-              <w:t xml:space="preserve">Cada intento con su secuencia de bloques, intentos fallidos, piezas agarradas y soltadas, y errores (choques y órdenes imposibles)</w:t>
+              <w:t xml:space="preserve">Cada intento con su secuencia de bloques, intentos fallidos, piezas agarradas y encajadas, y errores (choques y órdenes imposibles)</w:t>
             </w:r>
           </w:p>
         </w:tc>
@@ -7560,7 +7560,7 @@
           </w:tcPr>
           <w:p>
             <w:r>
-              <w:t xml:space="preserve">Cada opción marcada y desmarcada, y las selecciones incorrectas</w:t>
+              <w:t xml:space="preserve">Cada opción marcada, si era correcta y el tiempo desde la anterior</w:t>
             </w:r>
           </w:p>
         </w:tc>
@@ -7606,7 +7606,7 @@
           </w:tcPr>
           <w:p>
             <w:r>
-              <w:t xml:space="preserve">Cada figura intentada en cada hueco, las colocaciones incorrectas y la manipulación de fichas</w:t>
+              <w:t xml:space="preserve">Cada figura intentada en cada hueco, si encajaba, el tiempo desde la anterior y las fichas agarradas</w:t>
             </w:r>
           </w:p>
         </w:tc>

</xml_diff>

<commit_message>
docs: Context, README y GDD con 5 minutos por sala; compilación sin lista fija de archivos
- Context.md: tiempo por sala (sección 5), decisión y API, frase 21, audios 3 y 21 pendientes,
  estado del informe del mes 2 (sin subir todavía)
- README y GDD (regenerado) con 5 minutos por sala y la frase 3 nueva
- Herramientas: compilar.ps1 compila sin abrir Unity añadiendo los scripts que falten a una copia
  de los .csproj; docx_lib.js (zip y troceado de documentos Word sin dependencias)
- Recopilación del mes 2 marcada como superada por el informe
</commit_message>
<xml_diff>
--- a/Docs/Codea2_GDD.docx
+++ b/Docs/Codea2_GDD.docx
@@ -110,11 +110,528 @@
       </w:sdtPr>
       <w:sdtContent>
         <w:p>
+          <w:pPr>
+            <w:pStyle w:val="TOC1"/>
+            <w:tabs>
+              <w:tab w:val="right" w:pos="9638" w:leader="dot"/>
+            </w:tabs>
+          </w:pPr>
           <w:r>
             <w:fldChar w:fldCharType="begin" w:dirty="true"/>
             <w:instrText xml:space="preserve">TOC \h \o "1-2"</w:instrText>
             <w:fldChar w:fldCharType="separate"/>
           </w:r>
+          <w:hyperlink w:history="1" w:anchor="_Toc1">
+            <w:r>
+              <w:t xml:space="preserve">1. Ficha del juego</w:t>
+            </w:r>
+            <w:r>
+              <w:tab/>
+            </w:r>
+            <w:r>
+              <w:fldChar w:fldCharType="begin" w:dirty="true"/>
+              <w:instrText xml:space="preserve">PAGEREF _Toc1 \h</w:instrText>
+              <w:fldChar w:fldCharType="separate"/>
+              <w:fldChar w:fldCharType="end"/>
+            </w:r>
+          </w:hyperlink>
+        </w:p>
+        <w:p>
+          <w:pPr>
+            <w:pStyle w:val="TOC2"/>
+            <w:tabs>
+              <w:tab w:val="right" w:pos="9638" w:leader="dot"/>
+            </w:tabs>
+            <w:ind w:left="220"/>
+          </w:pPr>
+          <w:hyperlink w:history="1" w:anchor="_Toc2">
+            <w:r>
+              <w:t xml:space="preserve">Elementos de juego</w:t>
+            </w:r>
+            <w:r>
+              <w:tab/>
+            </w:r>
+            <w:r>
+              <w:fldChar w:fldCharType="begin" w:dirty="true"/>
+              <w:instrText xml:space="preserve">PAGEREF _Toc2 \h</w:instrText>
+              <w:fldChar w:fldCharType="separate"/>
+              <w:fldChar w:fldCharType="end"/>
+            </w:r>
+          </w:hyperlink>
+        </w:p>
+        <w:p>
+          <w:pPr>
+            <w:pStyle w:val="TOC1"/>
+            <w:tabs>
+              <w:tab w:val="right" w:pos="9638" w:leader="dot"/>
+            </w:tabs>
+          </w:pPr>
+          <w:hyperlink w:history="1" w:anchor="_Toc3">
+            <w:r>
+              <w:t xml:space="preserve">2. Especificaciones técnicas</w:t>
+            </w:r>
+            <w:r>
+              <w:tab/>
+            </w:r>
+            <w:r>
+              <w:fldChar w:fldCharType="begin" w:dirty="true"/>
+              <w:instrText xml:space="preserve">PAGEREF _Toc3 \h</w:instrText>
+              <w:fldChar w:fldCharType="separate"/>
+              <w:fldChar w:fldCharType="end"/>
+            </w:r>
+          </w:hyperlink>
+        </w:p>
+        <w:p>
+          <w:pPr>
+            <w:pStyle w:val="TOC1"/>
+            <w:tabs>
+              <w:tab w:val="right" w:pos="9638" w:leader="dot"/>
+            </w:tabs>
+          </w:pPr>
+          <w:hyperlink w:history="1" w:anchor="_Toc4">
+            <w:r>
+              <w:t xml:space="preserve">3. Jugabilidad</w:t>
+            </w:r>
+            <w:r>
+              <w:tab/>
+            </w:r>
+            <w:r>
+              <w:fldChar w:fldCharType="begin" w:dirty="true"/>
+              <w:instrText xml:space="preserve">PAGEREF _Toc4 \h</w:instrText>
+              <w:fldChar w:fldCharType="separate"/>
+              <w:fldChar w:fldCharType="end"/>
+            </w:r>
+          </w:hyperlink>
+        </w:p>
+        <w:p>
+          <w:pPr>
+            <w:pStyle w:val="TOC2"/>
+            <w:tabs>
+              <w:tab w:val="right" w:pos="9638" w:leader="dot"/>
+            </w:tabs>
+            <w:ind w:left="220"/>
+          </w:pPr>
+          <w:hyperlink w:history="1" w:anchor="_Toc5">
+            <w:r>
+              <w:t xml:space="preserve">Esquema del juego</w:t>
+            </w:r>
+            <w:r>
+              <w:tab/>
+            </w:r>
+            <w:r>
+              <w:fldChar w:fldCharType="begin" w:dirty="true"/>
+              <w:instrText xml:space="preserve">PAGEREF _Toc5 \h</w:instrText>
+              <w:fldChar w:fldCharType="separate"/>
+              <w:fldChar w:fldCharType="end"/>
+            </w:r>
+          </w:hyperlink>
+        </w:p>
+        <w:p>
+          <w:pPr>
+            <w:pStyle w:val="TOC1"/>
+            <w:tabs>
+              <w:tab w:val="right" w:pos="9638" w:leader="dot"/>
+            </w:tabs>
+          </w:pPr>
+          <w:hyperlink w:history="1" w:anchor="_Toc6">
+            <w:r>
+              <w:t xml:space="preserve">4. Características clave</w:t>
+            </w:r>
+            <w:r>
+              <w:tab/>
+            </w:r>
+            <w:r>
+              <w:fldChar w:fldCharType="begin" w:dirty="true"/>
+              <w:instrText xml:space="preserve">PAGEREF _Toc6 \h</w:instrText>
+              <w:fldChar w:fldCharType="separate"/>
+              <w:fldChar w:fldCharType="end"/>
+            </w:r>
+          </w:hyperlink>
+        </w:p>
+        <w:p>
+          <w:pPr>
+            <w:pStyle w:val="TOC1"/>
+            <w:tabs>
+              <w:tab w:val="right" w:pos="9638" w:leader="dot"/>
+            </w:tabs>
+          </w:pPr>
+          <w:hyperlink w:history="1" w:anchor="_Toc7">
+            <w:r>
+              <w:t xml:space="preserve">5. Documento de diseño</w:t>
+            </w:r>
+            <w:r>
+              <w:tab/>
+            </w:r>
+            <w:r>
+              <w:fldChar w:fldCharType="begin" w:dirty="true"/>
+              <w:instrText xml:space="preserve">PAGEREF _Toc7 \h</w:instrText>
+              <w:fldChar w:fldCharType="separate"/>
+              <w:fldChar w:fldCharType="end"/>
+            </w:r>
+          </w:hyperlink>
+        </w:p>
+        <w:p>
+          <w:pPr>
+            <w:pStyle w:val="TOC2"/>
+            <w:tabs>
+              <w:tab w:val="right" w:pos="9638" w:leader="dot"/>
+            </w:tabs>
+            <w:ind w:left="220"/>
+          </w:pPr>
+          <w:hyperlink w:history="1" w:anchor="_Toc8">
+            <w:r>
+              <w:t xml:space="preserve">5.1 Pautas de diseño</w:t>
+            </w:r>
+            <w:r>
+              <w:tab/>
+            </w:r>
+            <w:r>
+              <w:fldChar w:fldCharType="begin" w:dirty="true"/>
+              <w:instrText xml:space="preserve">PAGEREF _Toc8 \h</w:instrText>
+              <w:fldChar w:fldCharType="separate"/>
+              <w:fldChar w:fldCharType="end"/>
+            </w:r>
+          </w:hyperlink>
+        </w:p>
+        <w:p>
+          <w:pPr>
+            <w:pStyle w:val="TOC2"/>
+            <w:tabs>
+              <w:tab w:val="right" w:pos="9638" w:leader="dot"/>
+            </w:tabs>
+            <w:ind w:left="220"/>
+          </w:pPr>
+          <w:hyperlink w:history="1" w:anchor="_Toc9">
+            <w:r>
+              <w:t xml:space="preserve">5.2 Definiciones de juego</w:t>
+            </w:r>
+            <w:r>
+              <w:tab/>
+            </w:r>
+            <w:r>
+              <w:fldChar w:fldCharType="begin" w:dirty="true"/>
+              <w:instrText xml:space="preserve">PAGEREF _Toc9 \h</w:instrText>
+              <w:fldChar w:fldCharType="separate"/>
+              <w:fldChar w:fldCharType="end"/>
+            </w:r>
+          </w:hyperlink>
+        </w:p>
+        <w:p>
+          <w:pPr>
+            <w:pStyle w:val="TOC2"/>
+            <w:tabs>
+              <w:tab w:val="right" w:pos="9638" w:leader="dot"/>
+            </w:tabs>
+            <w:ind w:left="220"/>
+          </w:pPr>
+          <w:hyperlink w:history="1" w:anchor="_Toc10">
+            <w:r>
+              <w:t xml:space="preserve">5.3 Diagrama de flujo</w:t>
+            </w:r>
+            <w:r>
+              <w:tab/>
+            </w:r>
+            <w:r>
+              <w:fldChar w:fldCharType="begin" w:dirty="true"/>
+              <w:instrText xml:space="preserve">PAGEREF _Toc10 \h</w:instrText>
+              <w:fldChar w:fldCharType="separate"/>
+              <w:fldChar w:fldCharType="end"/>
+            </w:r>
+          </w:hyperlink>
+        </w:p>
+        <w:p>
+          <w:pPr>
+            <w:pStyle w:val="TOC2"/>
+            <w:tabs>
+              <w:tab w:val="right" w:pos="9638" w:leader="dot"/>
+            </w:tabs>
+            <w:ind w:left="220"/>
+          </w:pPr>
+          <w:hyperlink w:history="1" w:anchor="_Toc11">
+            <w:r>
+              <w:t xml:space="preserve">5.4 Definición del jugador</w:t>
+            </w:r>
+            <w:r>
+              <w:tab/>
+            </w:r>
+            <w:r>
+              <w:fldChar w:fldCharType="begin" w:dirty="true"/>
+              <w:instrText xml:space="preserve">PAGEREF _Toc11 \h</w:instrText>
+              <w:fldChar w:fldCharType="separate"/>
+              <w:fldChar w:fldCharType="end"/>
+            </w:r>
+          </w:hyperlink>
+        </w:p>
+        <w:p>
+          <w:pPr>
+            <w:pStyle w:val="TOC2"/>
+            <w:tabs>
+              <w:tab w:val="right" w:pos="9638" w:leader="dot"/>
+            </w:tabs>
+            <w:ind w:left="220"/>
+          </w:pPr>
+          <w:hyperlink w:history="1" w:anchor="_Toc12">
+            <w:r>
+              <w:t xml:space="preserve">5.5 Propiedades del jugador</w:t>
+            </w:r>
+            <w:r>
+              <w:tab/>
+            </w:r>
+            <w:r>
+              <w:fldChar w:fldCharType="begin" w:dirty="true"/>
+              <w:instrText xml:space="preserve">PAGEREF _Toc12 \h</w:instrText>
+              <w:fldChar w:fldCharType="separate"/>
+              <w:fldChar w:fldCharType="end"/>
+            </w:r>
+          </w:hyperlink>
+        </w:p>
+        <w:p>
+          <w:pPr>
+            <w:pStyle w:val="TOC2"/>
+            <w:tabs>
+              <w:tab w:val="right" w:pos="9638" w:leader="dot"/>
+            </w:tabs>
+            <w:ind w:left="220"/>
+          </w:pPr>
+          <w:hyperlink w:history="1" w:anchor="_Toc13">
+            <w:r>
+              <w:t xml:space="preserve">5.6 Recompensas y retroalimentación</w:t>
+            </w:r>
+            <w:r>
+              <w:tab/>
+            </w:r>
+            <w:r>
+              <w:fldChar w:fldCharType="begin" w:dirty="true"/>
+              <w:instrText xml:space="preserve">PAGEREF _Toc13 \h</w:instrText>
+              <w:fldChar w:fldCharType="separate"/>
+              <w:fldChar w:fldCharType="end"/>
+            </w:r>
+          </w:hyperlink>
+        </w:p>
+        <w:p>
+          <w:pPr>
+            <w:pStyle w:val="TOC2"/>
+            <w:tabs>
+              <w:tab w:val="right" w:pos="9638" w:leader="dot"/>
+            </w:tabs>
+            <w:ind w:left="220"/>
+          </w:pPr>
+          <w:hyperlink w:history="1" w:anchor="_Toc14">
+            <w:r>
+              <w:t xml:space="preserve">5.7 Interfaz y controles</w:t>
+            </w:r>
+            <w:r>
+              <w:tab/>
+            </w:r>
+            <w:r>
+              <w:fldChar w:fldCharType="begin" w:dirty="true"/>
+              <w:instrText xml:space="preserve">PAGEREF _Toc14 \h</w:instrText>
+              <w:fldChar w:fldCharType="separate"/>
+              <w:fldChar w:fldCharType="end"/>
+            </w:r>
+          </w:hyperlink>
+        </w:p>
+        <w:p>
+          <w:pPr>
+            <w:pStyle w:val="TOC1"/>
+            <w:tabs>
+              <w:tab w:val="right" w:pos="9638" w:leader="dot"/>
+            </w:tabs>
+          </w:pPr>
+          <w:hyperlink w:history="1" w:anchor="_Toc15">
+            <w:r>
+              <w:t xml:space="preserve">6. Salas</w:t>
+            </w:r>
+            <w:r>
+              <w:tab/>
+            </w:r>
+            <w:r>
+              <w:fldChar w:fldCharType="begin" w:dirty="true"/>
+              <w:instrText xml:space="preserve">PAGEREF _Toc15 \h</w:instrText>
+              <w:fldChar w:fldCharType="separate"/>
+              <w:fldChar w:fldCharType="end"/>
+            </w:r>
+          </w:hyperlink>
+        </w:p>
+        <w:p>
+          <w:pPr>
+            <w:pStyle w:val="TOC2"/>
+            <w:tabs>
+              <w:tab w:val="right" w:pos="9638" w:leader="dot"/>
+            </w:tabs>
+            <w:ind w:left="220"/>
+          </w:pPr>
+          <w:hyperlink w:history="1" w:anchor="_Toc16">
+            <w:r>
+              <w:t xml:space="preserve">6.1 Sala 1 — Dormitorio · Secuencialidad</w:t>
+            </w:r>
+            <w:r>
+              <w:tab/>
+            </w:r>
+            <w:r>
+              <w:fldChar w:fldCharType="begin" w:dirty="true"/>
+              <w:instrText xml:space="preserve">PAGEREF _Toc16 \h</w:instrText>
+              <w:fldChar w:fldCharType="separate"/>
+              <w:fldChar w:fldCharType="end"/>
+            </w:r>
+          </w:hyperlink>
+        </w:p>
+        <w:p>
+          <w:pPr>
+            <w:pStyle w:val="TOC2"/>
+            <w:tabs>
+              <w:tab w:val="right" w:pos="9638" w:leader="dot"/>
+            </w:tabs>
+            <w:ind w:left="220"/>
+          </w:pPr>
+          <w:hyperlink w:history="1" w:anchor="_Toc17">
+            <w:r>
+              <w:t xml:space="preserve">6.2 Sala 2 — Sala de control · Condicionales</w:t>
+            </w:r>
+            <w:r>
+              <w:tab/>
+            </w:r>
+            <w:r>
+              <w:fldChar w:fldCharType="begin" w:dirty="true"/>
+              <w:instrText xml:space="preserve">PAGEREF _Toc17 \h</w:instrText>
+              <w:fldChar w:fldCharType="separate"/>
+              <w:fldChar w:fldCharType="end"/>
+            </w:r>
+          </w:hyperlink>
+        </w:p>
+        <w:p>
+          <w:pPr>
+            <w:pStyle w:val="TOC2"/>
+            <w:tabs>
+              <w:tab w:val="right" w:pos="9638" w:leader="dot"/>
+            </w:tabs>
+            <w:ind w:left="220"/>
+          </w:pPr>
+          <w:hyperlink w:history="1" w:anchor="_Toc18">
+            <w:r>
+              <w:t xml:space="preserve">6.3 Sala 3 — Almacén · Bucles y parámetros</w:t>
+            </w:r>
+            <w:r>
+              <w:tab/>
+            </w:r>
+            <w:r>
+              <w:fldChar w:fldCharType="begin" w:dirty="true"/>
+              <w:instrText xml:space="preserve">PAGEREF _Toc18 \h</w:instrText>
+              <w:fldChar w:fldCharType="separate"/>
+              <w:fldChar w:fldCharType="end"/>
+            </w:r>
+          </w:hyperlink>
+        </w:p>
+        <w:p>
+          <w:pPr>
+            <w:pStyle w:val="TOC2"/>
+            <w:tabs>
+              <w:tab w:val="right" w:pos="9638" w:leader="dot"/>
+            </w:tabs>
+            <w:ind w:left="220"/>
+          </w:pPr>
+          <w:hyperlink w:history="1" w:anchor="_Toc19">
+            <w:r>
+              <w:t xml:space="preserve">6.4 Sala 4 — Panel final · Patrones</w:t>
+            </w:r>
+            <w:r>
+              <w:tab/>
+            </w:r>
+            <w:r>
+              <w:fldChar w:fldCharType="begin" w:dirty="true"/>
+              <w:instrText xml:space="preserve">PAGEREF _Toc19 \h</w:instrText>
+              <w:fldChar w:fldCharType="separate"/>
+              <w:fldChar w:fldCharType="end"/>
+            </w:r>
+          </w:hyperlink>
+        </w:p>
+        <w:p>
+          <w:pPr>
+            <w:pStyle w:val="TOC1"/>
+            <w:tabs>
+              <w:tab w:val="right" w:pos="9638" w:leader="dot"/>
+            </w:tabs>
+          </w:pPr>
+          <w:hyperlink w:history="1" w:anchor="_Toc20">
+            <w:r>
+              <w:t xml:space="preserve">7. Narrativa y guion</w:t>
+            </w:r>
+            <w:r>
+              <w:tab/>
+            </w:r>
+            <w:r>
+              <w:fldChar w:fldCharType="begin" w:dirty="true"/>
+              <w:instrText xml:space="preserve">PAGEREF _Toc20 \h</w:instrText>
+              <w:fldChar w:fldCharType="separate"/>
+              <w:fldChar w:fldCharType="end"/>
+            </w:r>
+          </w:hyperlink>
+        </w:p>
+        <w:p>
+          <w:pPr>
+            <w:pStyle w:val="TOC1"/>
+            <w:tabs>
+              <w:tab w:val="right" w:pos="9638" w:leader="dot"/>
+            </w:tabs>
+          </w:pPr>
+          <w:hyperlink w:history="1" w:anchor="_Toc21">
+            <w:r>
+              <w:t xml:space="preserve">8. Resumen de dificultades</w:t>
+            </w:r>
+            <w:r>
+              <w:tab/>
+            </w:r>
+            <w:r>
+              <w:fldChar w:fldCharType="begin" w:dirty="true"/>
+              <w:instrText xml:space="preserve">PAGEREF _Toc21 \h</w:instrText>
+              <w:fldChar w:fldCharType="separate"/>
+              <w:fldChar w:fldCharType="end"/>
+            </w:r>
+          </w:hyperlink>
+        </w:p>
+        <w:p>
+          <w:pPr>
+            <w:pStyle w:val="TOC1"/>
+            <w:tabs>
+              <w:tab w:val="right" w:pos="9638" w:leader="dot"/>
+            </w:tabs>
+          </w:pPr>
+          <w:hyperlink w:history="1" w:anchor="_Toc22">
+            <w:r>
+              <w:t xml:space="preserve">9. Registro de datos</w:t>
+            </w:r>
+            <w:r>
+              <w:tab/>
+            </w:r>
+            <w:r>
+              <w:fldChar w:fldCharType="begin" w:dirty="true"/>
+              <w:instrText xml:space="preserve">PAGEREF _Toc22 \h</w:instrText>
+              <w:fldChar w:fldCharType="separate"/>
+              <w:fldChar w:fldCharType="end"/>
+            </w:r>
+          </w:hyperlink>
+        </w:p>
+        <w:p>
+          <w:pPr>
+            <w:pStyle w:val="TOC1"/>
+            <w:tabs>
+              <w:tab w:val="right" w:pos="9638" w:leader="dot"/>
+            </w:tabs>
+          </w:pPr>
+          <w:hyperlink w:history="1" w:anchor="_Toc23">
+            <w:r>
+              <w:t xml:space="preserve">10. Fuera de alcance</w:t>
+            </w:r>
+            <w:r>
+              <w:tab/>
+            </w:r>
+            <w:r>
+              <w:fldChar w:fldCharType="begin" w:dirty="true"/>
+              <w:instrText xml:space="preserve">PAGEREF _Toc23 \h</w:instrText>
+              <w:fldChar w:fldCharType="separate"/>
+              <w:fldChar w:fldCharType="end"/>
+            </w:r>
+          </w:hyperlink>
         </w:p>
         <w:p>
           <w:r>
@@ -132,9 +649,11 @@
       <w:pPr>
         <w:pStyle w:val="Heading1"/>
       </w:pPr>
+      <w:bookmarkStart w:name="_Toc1" w:id="1"/>
       <w:r>
         <w:t xml:space="preserve">1. Ficha del juego</w:t>
       </w:r>
+      <w:bookmarkEnd w:id="1"/>
     </w:p>
     <w:tbl>
       <w:tblPr>
@@ -482,7 +1001,7 @@
           </w:tcPr>
           <w:p>
             <w:r>
-              <w:t xml:space="preserve">15 minutos de juego, con cuenta atrás visible</w:t>
+              <w:t xml:space="preserve">5 minutos por sala, con cuenta atrás visible; si se agotan, se pasa a la siguiente sala</w:t>
             </w:r>
           </w:p>
         </w:tc>
@@ -543,9 +1062,11 @@
       <w:pPr>
         <w:pStyle w:val="Heading2"/>
       </w:pPr>
+      <w:bookmarkStart w:name="_Toc2" w:id="2"/>
       <w:r>
         <w:t xml:space="preserve">Elementos de juego</w:t>
       </w:r>
+      <w:bookmarkEnd w:id="2"/>
     </w:p>
     <w:p>
       <w:pPr>
@@ -652,16 +1173,18 @@
         <w:t xml:space="preserve">Escapar contra reloj:</w:t>
       </w:r>
       <w:r>
-        <w:t xml:space="preserve"> cuatro salas en secuencia antes de que se agoten los 15 minutos.</w:t>
+        <w:t xml:space="preserve"> cuatro salas en secuencia, cinco minutos para cada una.</w:t>
       </w:r>
     </w:p>
     <w:p>
       <w:pPr>
         <w:pStyle w:val="Heading1"/>
       </w:pPr>
+      <w:bookmarkStart w:name="_Toc3" w:id="3"/>
       <w:r>
         <w:t xml:space="preserve">2. Especificaciones técnicas</w:t>
       </w:r>
+      <w:bookmarkEnd w:id="3"/>
     </w:p>
     <w:tbl>
       <w:tblPr>
@@ -1249,9 +1772,11 @@
       <w:pPr>
         <w:pStyle w:val="Heading1"/>
       </w:pPr>
+      <w:bookmarkStart w:name="_Toc4" w:id="4"/>
       <w:r>
         <w:t xml:space="preserve">3. Jugabilidad</w:t>
       </w:r>
+      <w:bookmarkEnd w:id="4"/>
     </w:p>
     <w:p>
       <w:pPr>
@@ -1273,9 +1798,11 @@
       <w:pPr>
         <w:pStyle w:val="Heading2"/>
       </w:pPr>
+      <w:bookmarkStart w:name="_Toc5" w:id="5"/>
       <w:r>
         <w:t xml:space="preserve">Esquema del juego</w:t>
       </w:r>
+      <w:bookmarkEnd w:id="5"/>
     </w:p>
     <w:tbl>
       <w:tblPr>
@@ -1715,7 +2242,7 @@
           </w:tcPr>
           <w:p>
             <w:r>
-              <w:t xml:space="preserve">Resolver las cuatro salas antes de que se agoten los 15 minutos.</w:t>
+              <w:t xml:space="preserve">Resolver las cuatro salas, cada una antes de que se agoten sus cinco minutos.</w:t>
             </w:r>
           </w:p>
         </w:tc>
@@ -1863,9 +2390,11 @@
       <w:pPr>
         <w:pStyle w:val="Heading1"/>
       </w:pPr>
+      <w:bookmarkStart w:name="_Toc6" w:id="6"/>
       <w:r>
         <w:t xml:space="preserve">4. Características clave</w:t>
       </w:r>
+      <w:bookmarkEnd w:id="6"/>
     </w:p>
     <w:p>
       <w:pPr>
@@ -2011,17 +2540,21 @@
       <w:pPr>
         <w:pStyle w:val="Heading1"/>
       </w:pPr>
+      <w:bookmarkStart w:name="_Toc7" w:id="7"/>
       <w:r>
         <w:t xml:space="preserve">5. Documento de diseño</w:t>
       </w:r>
+      <w:bookmarkEnd w:id="7"/>
     </w:p>
     <w:p>
       <w:pPr>
         <w:pStyle w:val="Heading2"/>
       </w:pPr>
+      <w:bookmarkStart w:name="_Toc8" w:id="8"/>
       <w:r>
         <w:t xml:space="preserve">5.1 Pautas de diseño</w:t>
       </w:r>
+      <w:bookmarkEnd w:id="8"/>
     </w:p>
     <w:p>
       <w:pPr>
@@ -2167,9 +2700,11 @@
       <w:pPr>
         <w:pStyle w:val="Heading2"/>
       </w:pPr>
+      <w:bookmarkStart w:name="_Toc9" w:id="9"/>
       <w:r>
         <w:t xml:space="preserve">5.2 Definiciones de juego</w:t>
       </w:r>
+      <w:bookmarkEnd w:id="9"/>
     </w:p>
     <w:tbl>
       <w:tblPr>
@@ -2287,7 +2822,7 @@
           </w:tcPr>
           <w:p>
             <w:r>
-              <w:t xml:space="preserve">Completar las cuatro salas dentro de los 15 minutos.</w:t>
+              <w:t xml:space="preserve">Completar cada sala dentro de sus cinco minutos.</w:t>
             </w:r>
           </w:p>
         </w:tc>
@@ -2532,9 +3067,11 @@
       <w:pPr>
         <w:pStyle w:val="Heading2"/>
       </w:pPr>
+      <w:bookmarkStart w:name="_Toc10" w:id="10"/>
       <w:r>
         <w:t xml:space="preserve">5.3 Diagrama de flujo</w:t>
       </w:r>
+      <w:bookmarkEnd w:id="10"/>
     </w:p>
     <w:p>
       <w:pPr>
@@ -2700,9 +3237,11 @@
       <w:pPr>
         <w:pStyle w:val="Heading2"/>
       </w:pPr>
+      <w:bookmarkStart w:name="_Toc11" w:id="11"/>
       <w:r>
         <w:t xml:space="preserve">5.4 Definición del jugador</w:t>
       </w:r>
+      <w:bookmarkEnd w:id="11"/>
     </w:p>
     <w:p>
       <w:pPr>
@@ -2716,9 +3255,11 @@
       <w:pPr>
         <w:pStyle w:val="Heading2"/>
       </w:pPr>
+      <w:bookmarkStart w:name="_Toc12" w:id="12"/>
       <w:r>
         <w:t xml:space="preserve">5.5 Propiedades del jugador</w:t>
       </w:r>
+      <w:bookmarkEnd w:id="12"/>
     </w:p>
     <w:tbl>
       <w:tblPr>
@@ -2864,7 +3405,7 @@
           </w:tcPr>
           <w:p>
             <w:r>
-              <w:t xml:space="preserve">Baja desde 15:00 a partir de «Iniciar»</w:t>
+              <w:t xml:space="preserve">Baja desde 05:00 al empezar cada sala</w:t>
             </w:r>
           </w:p>
         </w:tc>
@@ -3037,9 +3578,11 @@
       <w:pPr>
         <w:pStyle w:val="Heading2"/>
       </w:pPr>
+      <w:bookmarkStart w:name="_Toc13" w:id="13"/>
       <w:r>
         <w:t xml:space="preserve">5.6 Recompensas y retroalimentación</w:t>
       </w:r>
+      <w:bookmarkEnd w:id="13"/>
     </w:p>
     <w:p>
       <w:pPr>
@@ -3097,9 +3640,11 @@
       <w:pPr>
         <w:pStyle w:val="Heading2"/>
       </w:pPr>
+      <w:bookmarkStart w:name="_Toc14" w:id="14"/>
       <w:r>
         <w:t xml:space="preserve">5.7 Interfaz y controles</w:t>
       </w:r>
+      <w:bookmarkEnd w:id="14"/>
     </w:p>
     <w:p>
       <w:pPr>
@@ -3880,17 +4425,21 @@
       <w:pPr>
         <w:pStyle w:val="Heading1"/>
       </w:pPr>
+      <w:bookmarkStart w:name="_Toc15" w:id="15"/>
       <w:r>
         <w:t xml:space="preserve">6. Salas</w:t>
       </w:r>
+      <w:bookmarkEnd w:id="15"/>
     </w:p>
     <w:p>
       <w:pPr>
         <w:pStyle w:val="Heading2"/>
       </w:pPr>
+      <w:bookmarkStart w:name="_Toc16" w:id="16"/>
       <w:r>
         <w:t xml:space="preserve">6.1 Sala 1 — Dormitorio · Secuencialidad</w:t>
       </w:r>
+      <w:bookmarkEnd w:id="16"/>
     </w:p>
     <w:p>
       <w:pPr>
@@ -4390,9 +4939,11 @@
       <w:pPr>
         <w:pStyle w:val="Heading2"/>
       </w:pPr>
+      <w:bookmarkStart w:name="_Toc17" w:id="17"/>
       <w:r>
         <w:t xml:space="preserve">6.2 Sala 2 — Sala de control · Condicionales</w:t>
       </w:r>
+      <w:bookmarkEnd w:id="17"/>
     </w:p>
     <w:p>
       <w:pPr>
@@ -4698,9 +5249,11 @@
       <w:pPr>
         <w:pStyle w:val="Heading2"/>
       </w:pPr>
+      <w:bookmarkStart w:name="_Toc18" w:id="18"/>
       <w:r>
         <w:t xml:space="preserve">6.3 Sala 3 — Almacén · Bucles y parámetros</w:t>
       </w:r>
+      <w:bookmarkEnd w:id="18"/>
     </w:p>
     <w:p>
       <w:pPr>
@@ -5006,9 +5559,11 @@
       <w:pPr>
         <w:pStyle w:val="Heading2"/>
       </w:pPr>
+      <w:bookmarkStart w:name="_Toc19" w:id="19"/>
       <w:r>
         <w:t xml:space="preserve">6.4 Sala 4 — Panel final · Patrones</w:t>
       </w:r>
+      <w:bookmarkEnd w:id="19"/>
     </w:p>
     <w:p>
       <w:pPr>
@@ -5294,9 +5849,11 @@
       <w:pPr>
         <w:pStyle w:val="Heading1"/>
       </w:pPr>
+      <w:bookmarkStart w:name="_Toc20" w:id="20"/>
       <w:r>
         <w:t xml:space="preserve">7. Narrativa y guion</w:t>
       </w:r>
+      <w:bookmarkEnd w:id="20"/>
     </w:p>
     <w:p>
       <w:pPr>
@@ -5608,7 +6165,7 @@
           </w:tcPr>
           <w:p>
             <w:r>
-              <w:t xml:space="preserve">Tienes 15 minutos para completar la misión. Cuando estés listo, presiona «Iniciar» y el tiempo comenzará a correr.</w:t>
+              <w:t xml:space="preserve">Tienes cinco minutos para reparar cada sistema. Si se acaba el tiempo, pasaremos al siguiente. ¡Adelante, astronauta!</w:t>
             </w:r>
           </w:p>
         </w:tc>
@@ -6878,7 +7435,7 @@
           </w:tcPr>
           <w:p>
             <w:r>
-              <w:t xml:space="preserve">Tiempo agotado</w:t>
+              <w:t xml:space="preserve">Tiempo agotado en la última sala</w:t>
             </w:r>
           </w:p>
         </w:tc>
@@ -6905,14 +7462,84 @@
           </w:p>
         </w:tc>
       </w:tr>
+      <w:tr>
+        <w:tc>
+          <w:tcPr>
+            <w:tcW w:type="dxa" w:w="800"/>
+            <w:tcBorders>
+              <w:top w:val="single" w:color="B4B4B4" w:sz="4"/>
+              <w:left w:val="single" w:color="B4B4B4" w:sz="4"/>
+              <w:bottom w:val="single" w:color="B4B4B4" w:sz="4"/>
+              <w:right w:val="single" w:color="B4B4B4" w:sz="4"/>
+            </w:tcBorders>
+            <w:tcMar>
+              <w:top w:type="dxa" w:w="60"/>
+              <w:left w:type="dxa" w:w="100"/>
+              <w:bottom w:type="dxa" w:w="60"/>
+              <w:right w:type="dxa" w:w="100"/>
+            </w:tcMar>
+          </w:tcPr>
+          <w:p>
+            <w:r>
+              <w:t xml:space="preserve">21</w:t>
+            </w:r>
+          </w:p>
+        </w:tc>
+        <w:tc>
+          <w:tcPr>
+            <w:tcW w:type="dxa" w:w="2000"/>
+            <w:tcBorders>
+              <w:top w:val="single" w:color="B4B4B4" w:sz="4"/>
+              <w:left w:val="single" w:color="B4B4B4" w:sz="4"/>
+              <w:bottom w:val="single" w:color="B4B4B4" w:sz="4"/>
+              <w:right w:val="single" w:color="B4B4B4" w:sz="4"/>
+            </w:tcBorders>
+            <w:tcMar>
+              <w:top w:type="dxa" w:w="60"/>
+              <w:left w:type="dxa" w:w="100"/>
+              <w:bottom w:type="dxa" w:w="60"/>
+              <w:right w:type="dxa" w:w="100"/>
+            </w:tcMar>
+          </w:tcPr>
+          <w:p>
+            <w:r>
+              <w:t xml:space="preserve">Tiempo agotado en una sala</w:t>
+            </w:r>
+          </w:p>
+        </w:tc>
+        <w:tc>
+          <w:tcPr>
+            <w:tcW w:type="dxa" w:w="6838"/>
+            <w:tcBorders>
+              <w:top w:val="single" w:color="B4B4B4" w:sz="4"/>
+              <w:left w:val="single" w:color="B4B4B4" w:sz="4"/>
+              <w:bottom w:val="single" w:color="B4B4B4" w:sz="4"/>
+              <w:right w:val="single" w:color="B4B4B4" w:sz="4"/>
+            </w:tcBorders>
+            <w:tcMar>
+              <w:top w:type="dxa" w:w="60"/>
+              <w:left w:type="dxa" w:w="100"/>
+              <w:bottom w:type="dxa" w:w="60"/>
+              <w:right w:type="dxa" w:w="100"/>
+            </w:tcMar>
+          </w:tcPr>
+          <w:p>
+            <w:r>
+              <w:t xml:space="preserve">¡Se acabó el tiempo en esta sala! No te preocupes, astronauta: sigamos con la siguiente.</w:t>
+            </w:r>
+          </w:p>
+        </w:tc>
+      </w:tr>
     </w:tbl>
     <w:p>
       <w:pPr>
         <w:pStyle w:val="Heading1"/>
       </w:pPr>
+      <w:bookmarkStart w:name="_Toc21" w:id="21"/>
       <w:r>
         <w:t xml:space="preserve">8. Resumen de dificultades</w:t>
       </w:r>
+      <w:bookmarkEnd w:id="21"/>
     </w:p>
     <w:tbl>
       <w:tblPr>
@@ -7294,9 +7921,11 @@
       <w:pPr>
         <w:pStyle w:val="Heading1"/>
       </w:pPr>
+      <w:bookmarkStart w:name="_Toc22" w:id="22"/>
       <w:r>
         <w:t xml:space="preserve">9. Registro de datos</w:t>
       </w:r>
+      <w:bookmarkEnd w:id="22"/>
     </w:p>
     <w:p>
       <w:pPr>
@@ -7629,9 +8258,11 @@
       <w:pPr>
         <w:pStyle w:val="Heading1"/>
       </w:pPr>
+      <w:bookmarkStart w:name="_Toc23" w:id="23"/>
       <w:r>
         <w:t xml:space="preserve">10. Fuera de alcance</w:t>
       </w:r>
+      <w:bookmarkEnd w:id="23"/>
     </w:p>
     <w:p>
       <w:pPr>
@@ -7932,6 +8563,21 @@
   <w:style w:type="paragraph" w:styleId="Normal" w:default="1">
     <w:name w:val="Normal"/>
     <w:qFormat/>
+  </w:style>
+  <w:style w:type="table" w:styleId="TableNormal" w:default="true">
+    <w:name w:val="Normal Table"/>
+    <w:uiPriority w:val="99"/>
+    <w:semiHidden/>
+    <w:unhideWhenUsed/>
+    <w:tblPr>
+      <w:tblInd w:type="dxa" w:w="0"/>
+      <w:tblCellMar>
+        <w:top w:type="dxa" w:w="0"/>
+        <w:left w:type="dxa" w:w="108"/>
+        <w:bottom w:type="dxa" w:w="0"/>
+        <w:right w:type="dxa" w:w="108"/>
+      </w:tblCellMar>
+    </w:tblPr>
   </w:style>
   <w:style w:type="paragraph" w:styleId="Title">
     <w:name w:val="Title"/>

</xml_diff>

<commit_message>
docs: informe del mes 3 (Producto 3), GDD al día y versión 1.0.0
</commit_message>
<xml_diff>
--- a/Docs/Codea2_GDD.docx
+++ b/Docs/Codea2_GDD.docx
@@ -110,11 +110,515 @@
       </w:sdtPr>
       <w:sdtContent>
         <w:p>
+          <w:pPr>
+            <w:pStyle w:val="TOC1"/>
+            <w:tabs>
+              <w:tab w:val="right" w:pos="9638" w:leader="dot"/>
+            </w:tabs>
+          </w:pPr>
           <w:r>
             <w:fldChar w:fldCharType="begin" w:dirty="true"/>
             <w:instrText xml:space="preserve">TOC \h \o "1-2"</w:instrText>
             <w:fldChar w:fldCharType="separate"/>
           </w:r>
+          <w:hyperlink w:history="1" w:anchor="_Toc1">
+            <w:r>
+              <w:t xml:space="preserve">1. Ficha del juego</w:t>
+            </w:r>
+            <w:r>
+              <w:tab/>
+            </w:r>
+            <w:r>
+              <w:fldChar w:fldCharType="begin" w:dirty="true"/>
+              <w:instrText xml:space="preserve">PAGEREF _Toc1 \h</w:instrText>
+              <w:fldChar w:fldCharType="separate"/>
+              <w:fldChar w:fldCharType="end"/>
+            </w:r>
+          </w:hyperlink>
+        </w:p>
+        <w:p>
+          <w:pPr>
+            <w:pStyle w:val="TOC2"/>
+            <w:tabs>
+              <w:tab w:val="right" w:pos="9638" w:leader="dot"/>
+            </w:tabs>
+          </w:pPr>
+          <w:hyperlink w:history="1" w:anchor="_Toc2">
+            <w:r>
+              <w:t xml:space="preserve">Elementos de juego</w:t>
+            </w:r>
+            <w:r>
+              <w:tab/>
+            </w:r>
+            <w:r>
+              <w:fldChar w:fldCharType="begin" w:dirty="true"/>
+              <w:instrText xml:space="preserve">PAGEREF _Toc2 \h</w:instrText>
+              <w:fldChar w:fldCharType="separate"/>
+              <w:fldChar w:fldCharType="end"/>
+            </w:r>
+          </w:hyperlink>
+        </w:p>
+        <w:p>
+          <w:pPr>
+            <w:pStyle w:val="TOC1"/>
+            <w:tabs>
+              <w:tab w:val="right" w:pos="9638" w:leader="dot"/>
+            </w:tabs>
+          </w:pPr>
+          <w:hyperlink w:history="1" w:anchor="_Toc3">
+            <w:r>
+              <w:t xml:space="preserve">2. Especificaciones técnicas</w:t>
+            </w:r>
+            <w:r>
+              <w:tab/>
+            </w:r>
+            <w:r>
+              <w:fldChar w:fldCharType="begin" w:dirty="true"/>
+              <w:instrText xml:space="preserve">PAGEREF _Toc3 \h</w:instrText>
+              <w:fldChar w:fldCharType="separate"/>
+              <w:fldChar w:fldCharType="end"/>
+            </w:r>
+          </w:hyperlink>
+        </w:p>
+        <w:p>
+          <w:pPr>
+            <w:pStyle w:val="TOC1"/>
+            <w:tabs>
+              <w:tab w:val="right" w:pos="9638" w:leader="dot"/>
+            </w:tabs>
+          </w:pPr>
+          <w:hyperlink w:history="1" w:anchor="_Toc4">
+            <w:r>
+              <w:t xml:space="preserve">3. Jugabilidad</w:t>
+            </w:r>
+            <w:r>
+              <w:tab/>
+            </w:r>
+            <w:r>
+              <w:fldChar w:fldCharType="begin" w:dirty="true"/>
+              <w:instrText xml:space="preserve">PAGEREF _Toc4 \h</w:instrText>
+              <w:fldChar w:fldCharType="separate"/>
+              <w:fldChar w:fldCharType="end"/>
+            </w:r>
+          </w:hyperlink>
+        </w:p>
+        <w:p>
+          <w:pPr>
+            <w:pStyle w:val="TOC2"/>
+            <w:tabs>
+              <w:tab w:val="right" w:pos="9638" w:leader="dot"/>
+            </w:tabs>
+          </w:pPr>
+          <w:hyperlink w:history="1" w:anchor="_Toc5">
+            <w:r>
+              <w:t xml:space="preserve">Esquema del juego</w:t>
+            </w:r>
+            <w:r>
+              <w:tab/>
+            </w:r>
+            <w:r>
+              <w:fldChar w:fldCharType="begin" w:dirty="true"/>
+              <w:instrText xml:space="preserve">PAGEREF _Toc5 \h</w:instrText>
+              <w:fldChar w:fldCharType="separate"/>
+              <w:fldChar w:fldCharType="end"/>
+            </w:r>
+          </w:hyperlink>
+        </w:p>
+        <w:p>
+          <w:pPr>
+            <w:pStyle w:val="TOC1"/>
+            <w:tabs>
+              <w:tab w:val="right" w:pos="9638" w:leader="dot"/>
+            </w:tabs>
+          </w:pPr>
+          <w:hyperlink w:history="1" w:anchor="_Toc6">
+            <w:r>
+              <w:t xml:space="preserve">4. Características clave</w:t>
+            </w:r>
+            <w:r>
+              <w:tab/>
+            </w:r>
+            <w:r>
+              <w:fldChar w:fldCharType="begin" w:dirty="true"/>
+              <w:instrText xml:space="preserve">PAGEREF _Toc6 \h</w:instrText>
+              <w:fldChar w:fldCharType="separate"/>
+              <w:fldChar w:fldCharType="end"/>
+            </w:r>
+          </w:hyperlink>
+        </w:p>
+        <w:p>
+          <w:pPr>
+            <w:pStyle w:val="TOC1"/>
+            <w:tabs>
+              <w:tab w:val="right" w:pos="9638" w:leader="dot"/>
+            </w:tabs>
+          </w:pPr>
+          <w:hyperlink w:history="1" w:anchor="_Toc7">
+            <w:r>
+              <w:t xml:space="preserve">5. Documento de diseño</w:t>
+            </w:r>
+            <w:r>
+              <w:tab/>
+            </w:r>
+            <w:r>
+              <w:fldChar w:fldCharType="begin" w:dirty="true"/>
+              <w:instrText xml:space="preserve">PAGEREF _Toc7 \h</w:instrText>
+              <w:fldChar w:fldCharType="separate"/>
+              <w:fldChar w:fldCharType="end"/>
+            </w:r>
+          </w:hyperlink>
+        </w:p>
+        <w:p>
+          <w:pPr>
+            <w:pStyle w:val="TOC2"/>
+            <w:tabs>
+              <w:tab w:val="right" w:pos="9638" w:leader="dot"/>
+            </w:tabs>
+          </w:pPr>
+          <w:hyperlink w:history="1" w:anchor="_Toc8">
+            <w:r>
+              <w:t xml:space="preserve">5.1 Pautas de diseño</w:t>
+            </w:r>
+            <w:r>
+              <w:tab/>
+            </w:r>
+            <w:r>
+              <w:fldChar w:fldCharType="begin" w:dirty="true"/>
+              <w:instrText xml:space="preserve">PAGEREF _Toc8 \h</w:instrText>
+              <w:fldChar w:fldCharType="separate"/>
+              <w:fldChar w:fldCharType="end"/>
+            </w:r>
+          </w:hyperlink>
+        </w:p>
+        <w:p>
+          <w:pPr>
+            <w:pStyle w:val="TOC2"/>
+            <w:tabs>
+              <w:tab w:val="right" w:pos="9638" w:leader="dot"/>
+            </w:tabs>
+          </w:pPr>
+          <w:hyperlink w:history="1" w:anchor="_Toc9">
+            <w:r>
+              <w:t xml:space="preserve">5.2 Definiciones de juego</w:t>
+            </w:r>
+            <w:r>
+              <w:tab/>
+            </w:r>
+            <w:r>
+              <w:fldChar w:fldCharType="begin" w:dirty="true"/>
+              <w:instrText xml:space="preserve">PAGEREF _Toc9 \h</w:instrText>
+              <w:fldChar w:fldCharType="separate"/>
+              <w:fldChar w:fldCharType="end"/>
+            </w:r>
+          </w:hyperlink>
+        </w:p>
+        <w:p>
+          <w:pPr>
+            <w:pStyle w:val="TOC2"/>
+            <w:tabs>
+              <w:tab w:val="right" w:pos="9638" w:leader="dot"/>
+            </w:tabs>
+          </w:pPr>
+          <w:hyperlink w:history="1" w:anchor="_Toc10">
+            <w:r>
+              <w:t xml:space="preserve">5.3 Diagrama de flujo</w:t>
+            </w:r>
+            <w:r>
+              <w:tab/>
+            </w:r>
+            <w:r>
+              <w:fldChar w:fldCharType="begin" w:dirty="true"/>
+              <w:instrText xml:space="preserve">PAGEREF _Toc10 \h</w:instrText>
+              <w:fldChar w:fldCharType="separate"/>
+              <w:fldChar w:fldCharType="end"/>
+            </w:r>
+          </w:hyperlink>
+        </w:p>
+        <w:p>
+          <w:pPr>
+            <w:pStyle w:val="TOC2"/>
+            <w:tabs>
+              <w:tab w:val="right" w:pos="9638" w:leader="dot"/>
+            </w:tabs>
+          </w:pPr>
+          <w:hyperlink w:history="1" w:anchor="_Toc11">
+            <w:r>
+              <w:t xml:space="preserve">5.4 Definición del jugador</w:t>
+            </w:r>
+            <w:r>
+              <w:tab/>
+            </w:r>
+            <w:r>
+              <w:fldChar w:fldCharType="begin" w:dirty="true"/>
+              <w:instrText xml:space="preserve">PAGEREF _Toc11 \h</w:instrText>
+              <w:fldChar w:fldCharType="separate"/>
+              <w:fldChar w:fldCharType="end"/>
+            </w:r>
+          </w:hyperlink>
+        </w:p>
+        <w:p>
+          <w:pPr>
+            <w:pStyle w:val="TOC2"/>
+            <w:tabs>
+              <w:tab w:val="right" w:pos="9638" w:leader="dot"/>
+            </w:tabs>
+          </w:pPr>
+          <w:hyperlink w:history="1" w:anchor="_Toc12">
+            <w:r>
+              <w:t xml:space="preserve">5.5 Propiedades del jugador</w:t>
+            </w:r>
+            <w:r>
+              <w:tab/>
+            </w:r>
+            <w:r>
+              <w:fldChar w:fldCharType="begin" w:dirty="true"/>
+              <w:instrText xml:space="preserve">PAGEREF _Toc12 \h</w:instrText>
+              <w:fldChar w:fldCharType="separate"/>
+              <w:fldChar w:fldCharType="end"/>
+            </w:r>
+          </w:hyperlink>
+        </w:p>
+        <w:p>
+          <w:pPr>
+            <w:pStyle w:val="TOC2"/>
+            <w:tabs>
+              <w:tab w:val="right" w:pos="9638" w:leader="dot"/>
+            </w:tabs>
+          </w:pPr>
+          <w:hyperlink w:history="1" w:anchor="_Toc13">
+            <w:r>
+              <w:t xml:space="preserve">5.6 Recompensas y retroalimentación</w:t>
+            </w:r>
+            <w:r>
+              <w:tab/>
+            </w:r>
+            <w:r>
+              <w:fldChar w:fldCharType="begin" w:dirty="true"/>
+              <w:instrText xml:space="preserve">PAGEREF _Toc13 \h</w:instrText>
+              <w:fldChar w:fldCharType="separate"/>
+              <w:fldChar w:fldCharType="end"/>
+            </w:r>
+          </w:hyperlink>
+        </w:p>
+        <w:p>
+          <w:pPr>
+            <w:pStyle w:val="TOC2"/>
+            <w:tabs>
+              <w:tab w:val="right" w:pos="9638" w:leader="dot"/>
+            </w:tabs>
+          </w:pPr>
+          <w:hyperlink w:history="1" w:anchor="_Toc14">
+            <w:r>
+              <w:t xml:space="preserve">5.7 Interfaz y controles</w:t>
+            </w:r>
+            <w:r>
+              <w:tab/>
+            </w:r>
+            <w:r>
+              <w:fldChar w:fldCharType="begin" w:dirty="true"/>
+              <w:instrText xml:space="preserve">PAGEREF _Toc14 \h</w:instrText>
+              <w:fldChar w:fldCharType="separate"/>
+              <w:fldChar w:fldCharType="end"/>
+            </w:r>
+          </w:hyperlink>
+        </w:p>
+        <w:p>
+          <w:pPr>
+            <w:pStyle w:val="TOC1"/>
+            <w:tabs>
+              <w:tab w:val="right" w:pos="9638" w:leader="dot"/>
+            </w:tabs>
+          </w:pPr>
+          <w:hyperlink w:history="1" w:anchor="_Toc15">
+            <w:r>
+              <w:t xml:space="preserve">6. Salas</w:t>
+            </w:r>
+            <w:r>
+              <w:tab/>
+            </w:r>
+            <w:r>
+              <w:fldChar w:fldCharType="begin" w:dirty="true"/>
+              <w:instrText xml:space="preserve">PAGEREF _Toc15 \h</w:instrText>
+              <w:fldChar w:fldCharType="separate"/>
+              <w:fldChar w:fldCharType="end"/>
+            </w:r>
+          </w:hyperlink>
+        </w:p>
+        <w:p>
+          <w:pPr>
+            <w:pStyle w:val="TOC2"/>
+            <w:tabs>
+              <w:tab w:val="right" w:pos="9638" w:leader="dot"/>
+            </w:tabs>
+          </w:pPr>
+          <w:hyperlink w:history="1" w:anchor="_Toc16">
+            <w:r>
+              <w:t xml:space="preserve">6.1 Sala 1 — Dormitorio · Secuencialidad</w:t>
+            </w:r>
+            <w:r>
+              <w:tab/>
+            </w:r>
+            <w:r>
+              <w:fldChar w:fldCharType="begin" w:dirty="true"/>
+              <w:instrText xml:space="preserve">PAGEREF _Toc16 \h</w:instrText>
+              <w:fldChar w:fldCharType="separate"/>
+              <w:fldChar w:fldCharType="end"/>
+            </w:r>
+          </w:hyperlink>
+        </w:p>
+        <w:p>
+          <w:pPr>
+            <w:pStyle w:val="TOC2"/>
+            <w:tabs>
+              <w:tab w:val="right" w:pos="9638" w:leader="dot"/>
+            </w:tabs>
+          </w:pPr>
+          <w:hyperlink w:history="1" w:anchor="_Toc17">
+            <w:r>
+              <w:t xml:space="preserve">6.2 Sala 2 — Sala de control · Condicionales</w:t>
+            </w:r>
+            <w:r>
+              <w:tab/>
+            </w:r>
+            <w:r>
+              <w:fldChar w:fldCharType="begin" w:dirty="true"/>
+              <w:instrText xml:space="preserve">PAGEREF _Toc17 \h</w:instrText>
+              <w:fldChar w:fldCharType="separate"/>
+              <w:fldChar w:fldCharType="end"/>
+            </w:r>
+          </w:hyperlink>
+        </w:p>
+        <w:p>
+          <w:pPr>
+            <w:pStyle w:val="TOC2"/>
+            <w:tabs>
+              <w:tab w:val="right" w:pos="9638" w:leader="dot"/>
+            </w:tabs>
+          </w:pPr>
+          <w:hyperlink w:history="1" w:anchor="_Toc18">
+            <w:r>
+              <w:t xml:space="preserve">6.3 Sala 3 — Almacén · Bucles y parámetros</w:t>
+            </w:r>
+            <w:r>
+              <w:tab/>
+            </w:r>
+            <w:r>
+              <w:fldChar w:fldCharType="begin" w:dirty="true"/>
+              <w:instrText xml:space="preserve">PAGEREF _Toc18 \h</w:instrText>
+              <w:fldChar w:fldCharType="separate"/>
+              <w:fldChar w:fldCharType="end"/>
+            </w:r>
+          </w:hyperlink>
+        </w:p>
+        <w:p>
+          <w:pPr>
+            <w:pStyle w:val="TOC2"/>
+            <w:tabs>
+              <w:tab w:val="right" w:pos="9638" w:leader="dot"/>
+            </w:tabs>
+          </w:pPr>
+          <w:hyperlink w:history="1" w:anchor="_Toc19">
+            <w:r>
+              <w:t xml:space="preserve">6.4 Sala 4 — Panel final · Patrones</w:t>
+            </w:r>
+            <w:r>
+              <w:tab/>
+            </w:r>
+            <w:r>
+              <w:fldChar w:fldCharType="begin" w:dirty="true"/>
+              <w:instrText xml:space="preserve">PAGEREF _Toc19 \h</w:instrText>
+              <w:fldChar w:fldCharType="separate"/>
+              <w:fldChar w:fldCharType="end"/>
+            </w:r>
+          </w:hyperlink>
+        </w:p>
+        <w:p>
+          <w:pPr>
+            <w:pStyle w:val="TOC1"/>
+            <w:tabs>
+              <w:tab w:val="right" w:pos="9638" w:leader="dot"/>
+            </w:tabs>
+          </w:pPr>
+          <w:hyperlink w:history="1" w:anchor="_Toc20">
+            <w:r>
+              <w:t xml:space="preserve">7. Narrativa y guion</w:t>
+            </w:r>
+            <w:r>
+              <w:tab/>
+            </w:r>
+            <w:r>
+              <w:fldChar w:fldCharType="begin" w:dirty="true"/>
+              <w:instrText xml:space="preserve">PAGEREF _Toc20 \h</w:instrText>
+              <w:fldChar w:fldCharType="separate"/>
+              <w:fldChar w:fldCharType="end"/>
+            </w:r>
+          </w:hyperlink>
+        </w:p>
+        <w:p>
+          <w:pPr>
+            <w:pStyle w:val="TOC1"/>
+            <w:tabs>
+              <w:tab w:val="right" w:pos="9638" w:leader="dot"/>
+            </w:tabs>
+          </w:pPr>
+          <w:hyperlink w:history="1" w:anchor="_Toc21">
+            <w:r>
+              <w:t xml:space="preserve">8. Resumen de dificultades</w:t>
+            </w:r>
+            <w:r>
+              <w:tab/>
+            </w:r>
+            <w:r>
+              <w:fldChar w:fldCharType="begin" w:dirty="true"/>
+              <w:instrText xml:space="preserve">PAGEREF _Toc21 \h</w:instrText>
+              <w:fldChar w:fldCharType="separate"/>
+              <w:fldChar w:fldCharType="end"/>
+            </w:r>
+          </w:hyperlink>
+        </w:p>
+        <w:p>
+          <w:pPr>
+            <w:pStyle w:val="TOC1"/>
+            <w:tabs>
+              <w:tab w:val="right" w:pos="9638" w:leader="dot"/>
+            </w:tabs>
+          </w:pPr>
+          <w:hyperlink w:history="1" w:anchor="_Toc22">
+            <w:r>
+              <w:t xml:space="preserve">9. Registro de datos</w:t>
+            </w:r>
+            <w:r>
+              <w:tab/>
+            </w:r>
+            <w:r>
+              <w:fldChar w:fldCharType="begin" w:dirty="true"/>
+              <w:instrText xml:space="preserve">PAGEREF _Toc22 \h</w:instrText>
+              <w:fldChar w:fldCharType="separate"/>
+              <w:fldChar w:fldCharType="end"/>
+            </w:r>
+          </w:hyperlink>
+        </w:p>
+        <w:p>
+          <w:pPr>
+            <w:pStyle w:val="TOC1"/>
+            <w:tabs>
+              <w:tab w:val="right" w:pos="9638" w:leader="dot"/>
+            </w:tabs>
+          </w:pPr>
+          <w:hyperlink w:history="1" w:anchor="_Toc23">
+            <w:r>
+              <w:t xml:space="preserve">10. Fuera de alcance</w:t>
+            </w:r>
+            <w:r>
+              <w:tab/>
+            </w:r>
+            <w:r>
+              <w:fldChar w:fldCharType="begin" w:dirty="true"/>
+              <w:instrText xml:space="preserve">PAGEREF _Toc23 \h</w:instrText>
+              <w:fldChar w:fldCharType="separate"/>
+              <w:fldChar w:fldCharType="end"/>
+            </w:r>
+          </w:hyperlink>
         </w:p>
         <w:p>
           <w:r>
@@ -132,9 +636,11 @@
       <w:pPr>
         <w:pStyle w:val="Heading1"/>
       </w:pPr>
+      <w:bookmarkStart w:name="_Toc1" w:id="1"/>
       <w:r>
         <w:t xml:space="preserve">1. Ficha del juego</w:t>
       </w:r>
+      <w:bookmarkEnd w:id="1"/>
     </w:p>
     <w:tbl>
       <w:tblPr>
@@ -543,9 +1049,11 @@
       <w:pPr>
         <w:pStyle w:val="Heading2"/>
       </w:pPr>
+      <w:bookmarkStart w:name="_Toc2" w:id="2"/>
       <w:r>
         <w:t xml:space="preserve">Elementos de juego</w:t>
       </w:r>
+      <w:bookmarkEnd w:id="2"/>
     </w:p>
     <w:p>
       <w:pPr>
@@ -659,9 +1167,11 @@
       <w:pPr>
         <w:pStyle w:val="Heading1"/>
       </w:pPr>
+      <w:bookmarkStart w:name="_Toc3" w:id="3"/>
       <w:r>
         <w:t xml:space="preserve">2. Especificaciones técnicas</w:t>
       </w:r>
+      <w:bookmarkEnd w:id="3"/>
     </w:p>
     <w:tbl>
       <w:tblPr>
@@ -1249,9 +1759,11 @@
       <w:pPr>
         <w:pStyle w:val="Heading1"/>
       </w:pPr>
+      <w:bookmarkStart w:name="_Toc4" w:id="4"/>
       <w:r>
         <w:t xml:space="preserve">3. Jugabilidad</w:t>
       </w:r>
+      <w:bookmarkEnd w:id="4"/>
     </w:p>
     <w:p>
       <w:pPr>
@@ -1273,9 +1785,11 @@
       <w:pPr>
         <w:pStyle w:val="Heading2"/>
       </w:pPr>
+      <w:bookmarkStart w:name="_Toc5" w:id="5"/>
       <w:r>
         <w:t xml:space="preserve">Esquema del juego</w:t>
       </w:r>
+      <w:bookmarkEnd w:id="5"/>
     </w:p>
     <w:tbl>
       <w:tblPr>
@@ -1863,9 +2377,11 @@
       <w:pPr>
         <w:pStyle w:val="Heading1"/>
       </w:pPr>
+      <w:bookmarkStart w:name="_Toc6" w:id="6"/>
       <w:r>
         <w:t xml:space="preserve">4. Características clave</w:t>
       </w:r>
+      <w:bookmarkEnd w:id="6"/>
     </w:p>
     <w:p>
       <w:pPr>
@@ -2011,17 +2527,21 @@
       <w:pPr>
         <w:pStyle w:val="Heading1"/>
       </w:pPr>
+      <w:bookmarkStart w:name="_Toc7" w:id="7"/>
       <w:r>
         <w:t xml:space="preserve">5. Documento de diseño</w:t>
       </w:r>
+      <w:bookmarkEnd w:id="7"/>
     </w:p>
     <w:p>
       <w:pPr>
         <w:pStyle w:val="Heading2"/>
       </w:pPr>
+      <w:bookmarkStart w:name="_Toc8" w:id="8"/>
       <w:r>
         <w:t xml:space="preserve">5.1 Pautas de diseño</w:t>
       </w:r>
+      <w:bookmarkEnd w:id="8"/>
     </w:p>
     <w:p>
       <w:pPr>
@@ -2167,9 +2687,11 @@
       <w:pPr>
         <w:pStyle w:val="Heading2"/>
       </w:pPr>
+      <w:bookmarkStart w:name="_Toc9" w:id="9"/>
       <w:r>
         <w:t xml:space="preserve">5.2 Definiciones de juego</w:t>
       </w:r>
+      <w:bookmarkEnd w:id="9"/>
     </w:p>
     <w:tbl>
       <w:tblPr>
@@ -2425,7 +2947,7 @@
           </w:tcPr>
           <w:p>
             <w:r>
-              <w:t xml:space="preserve">Cada vez que se pulsa Ejecutar con un programa válido (salas 1 y 3), o cada vez que se encaja una ficha (sala 4).</w:t>
+              <w:t xml:space="preserve">Cada vez que se pulsa Probar con un programa válido (salas 1, 2 y 3), o cada vez que se encaja una ficha (sala 4).</w:t>
             </w:r>
           </w:p>
         </w:tc>
@@ -2532,9 +3054,11 @@
       <w:pPr>
         <w:pStyle w:val="Heading2"/>
       </w:pPr>
+      <w:bookmarkStart w:name="_Toc10" w:id="10"/>
       <w:r>
         <w:t xml:space="preserve">5.3 Diagrama de flujo</w:t>
       </w:r>
+      <w:bookmarkEnd w:id="10"/>
     </w:p>
     <w:p>
       <w:pPr>
@@ -2573,7 +3097,7 @@
         <w:t xml:space="preserve">Introducción:</w:t>
       </w:r>
       <w:r>
-        <w:t xml:space="preserve"> bienvenida, contexto de la tormenta y el reloj. El jugador pulsa «Iniciar».</w:t>
+        <w:t xml:space="preserve"> bienvenida, contexto de la tormenta y el reloj. El jugador pulsa «Probar».</w:t>
       </w:r>
     </w:p>
     <w:p>
@@ -2700,9 +3224,11 @@
       <w:pPr>
         <w:pStyle w:val="Heading2"/>
       </w:pPr>
+      <w:bookmarkStart w:name="_Toc11" w:id="11"/>
       <w:r>
         <w:t xml:space="preserve">5.4 Definición del jugador</w:t>
       </w:r>
+      <w:bookmarkEnd w:id="11"/>
     </w:p>
     <w:p>
       <w:pPr>
@@ -2716,9 +3242,11 @@
       <w:pPr>
         <w:pStyle w:val="Heading2"/>
       </w:pPr>
+      <w:bookmarkStart w:name="_Toc12" w:id="12"/>
       <w:r>
         <w:t xml:space="preserve">5.5 Propiedades del jugador</w:t>
       </w:r>
+      <w:bookmarkEnd w:id="12"/>
     </w:p>
     <w:tbl>
       <w:tblPr>
@@ -3037,9 +3565,11 @@
       <w:pPr>
         <w:pStyle w:val="Heading2"/>
       </w:pPr>
+      <w:bookmarkStart w:name="_Toc13" w:id="13"/>
       <w:r>
         <w:t xml:space="preserve">5.6 Recompensas y retroalimentación</w:t>
       </w:r>
+      <w:bookmarkEnd w:id="13"/>
     </w:p>
     <w:p>
       <w:pPr>
@@ -3097,9 +3627,11 @@
       <w:pPr>
         <w:pStyle w:val="Heading2"/>
       </w:pPr>
+      <w:bookmarkStart w:name="_Toc14" w:id="14"/>
       <w:r>
         <w:t xml:space="preserve">5.7 Interfaz y controles</w:t>
       </w:r>
+      <w:bookmarkEnd w:id="14"/>
     </w:p>
     <w:p>
       <w:pPr>
@@ -3880,17 +4412,21 @@
       <w:pPr>
         <w:pStyle w:val="Heading1"/>
       </w:pPr>
+      <w:bookmarkStart w:name="_Toc15" w:id="15"/>
       <w:r>
         <w:t xml:space="preserve">6. Salas</w:t>
       </w:r>
+      <w:bookmarkEnd w:id="15"/>
     </w:p>
     <w:p>
       <w:pPr>
         <w:pStyle w:val="Heading2"/>
       </w:pPr>
+      <w:bookmarkStart w:name="_Toc16" w:id="16"/>
       <w:r>
         <w:t xml:space="preserve">6.1 Sala 1 — Dormitorio · Secuencialidad</w:t>
       </w:r>
+      <w:bookmarkEnd w:id="16"/>
     </w:p>
     <w:p>
       <w:pPr>
@@ -3919,7 +4455,7 @@
         <w:t xml:space="preserve">Mecánica:</w:t>
       </w:r>
       <w:r>
-        <w:t xml:space="preserve"> el jugador ordena bloques en la fila y pulsa Ejecutar. Roki cumple las instrucciones una a una. Si choca o la secuencia termina sin llegar, el nivel se reinicia solo y el jugador puede corregir.</w:t>
+        <w:t xml:space="preserve"> el jugador ordena bloques en la fila y pulsa Probar. Roki empieza mirando hacia el fondo de la sala y cumple las instrucciones una a una. Si choca o la secuencia termina sin llegar, el nivel se reinicia solo y el jugador puede corregir.</w:t>
       </w:r>
     </w:p>
     <w:p>
@@ -4390,9 +4926,11 @@
       <w:pPr>
         <w:pStyle w:val="Heading2"/>
       </w:pPr>
+      <w:bookmarkStart w:name="_Toc17" w:id="17"/>
       <w:r>
         <w:t xml:space="preserve">6.2 Sala 2 — Sala de control · Condicionales</w:t>
       </w:r>
+      <w:bookmarkEnd w:id="17"/>
     </w:p>
     <w:p>
       <w:pPr>
@@ -4431,7 +4969,7 @@
         <w:t xml:space="preserve">síntomas, no la causa</w:t>
       </w:r>
       <w:r>
-        <w:t xml:space="preserve">: «los motores hacen ruido pero no arrancan». El jugador marca y desmarca opciones, y el módulo se repara cuando lo marcado coincide exactamente con lo correcto.</w:t>
+        <w:t xml:space="preserve">: «los motores no arrancan». El jugador marca y desmarca opciones, y el módulo se repara cuando lo marcado coincide exactamente con lo correcto.</w:t>
       </w:r>
     </w:p>
     <w:p>
@@ -4698,9 +5236,11 @@
       <w:pPr>
         <w:pStyle w:val="Heading2"/>
       </w:pPr>
+      <w:bookmarkStart w:name="_Toc18" w:id="18"/>
       <w:r>
         <w:t xml:space="preserve">6.3 Sala 3 — Almacén · Bucles y parámetros</w:t>
       </w:r>
+      <w:bookmarkEnd w:id="18"/>
     </w:p>
     <w:p>
       <w:pPr>
@@ -4754,7 +5294,7 @@
         <w:t xml:space="preserve">Reglas de apoyo:</w:t>
       </w:r>
       <w:r>
-        <w:t xml:space="preserve"> al poner una ficha las repeticiones vuelven a 0 y el programa no se ejecuta hasta elegir cuántas. Sin ficha tampoco se ejecuta. Si una secuencia recoge una caja y no la suelta, al terminar la caja vuelve sola a su pila.</w:t>
+        <w:t xml:space="preserve"> el contador de repeticiones resta 1 por cada vuelta terminada y acaba en 0, así que para la pasada siguiente hay que volver a elegir cuántas; cambiar de ficha no lo reinicia, y con 0 el programa no se ejecuta. Sin ficha tampoco se ejecuta. Si una secuencia recoge una caja y no la suelta, al terminar la caja vuelve sola a su pila.</w:t>
       </w:r>
     </w:p>
     <w:tbl>
@@ -5006,9 +5546,11 @@
       <w:pPr>
         <w:pStyle w:val="Heading2"/>
       </w:pPr>
+      <w:bookmarkStart w:name="_Toc19" w:id="19"/>
       <w:r>
         <w:t xml:space="preserve">6.4 Sala 4 — Panel final · Patrones</w:t>
       </w:r>
+      <w:bookmarkEnd w:id="19"/>
     </w:p>
     <w:p>
       <w:pPr>
@@ -5362,9 +5904,11 @@
       <w:pPr>
         <w:pStyle w:val="Heading1"/>
       </w:pPr>
+      <w:bookmarkStart w:name="_Toc20" w:id="20"/>
       <w:r>
         <w:t xml:space="preserve">7. Narrativa y guion</w:t>
       </w:r>
+      <w:bookmarkEnd w:id="20"/>
     </w:p>
     <w:p>
       <w:pPr>
@@ -5540,7 +6084,7 @@
           </w:tcPr>
           <w:p>
             <w:r>
-              <w:t xml:space="preserve">¡Bienvenido, astronauta! Tu misión está a punto de comenzar.</w:t>
+              <w:t xml:space="preserve">¡Bienvenido, astronauta! Una tormenta espacial dañó la nave. ¡Necesitamos tu ayuda!</w:t>
             </w:r>
           </w:p>
         </w:tc>
@@ -5564,7 +6108,7 @@
           </w:tcPr>
           <w:p>
             <w:r>
-              <w:t xml:space="preserve">2</w:t>
+              <w:t xml:space="preserve">3</w:t>
             </w:r>
           </w:p>
         </w:tc>
@@ -5608,7 +6152,7 @@
           </w:tcPr>
           <w:p>
             <w:r>
-              <w:t xml:space="preserve">Una tormenta espacial desordenó algunas cosas y provocó pequeñas fallas. Necesitamos tu ayuda para que la nave continúe su viaje.</w:t>
+              <w:t xml:space="preserve">Tienes quince minutos para repararla. ¡Adelante!</w:t>
             </w:r>
           </w:p>
         </w:tc>
@@ -5632,7 +6176,7 @@
           </w:tcPr>
           <w:p>
             <w:r>
-              <w:t xml:space="preserve">3</w:t>
+              <w:t xml:space="preserve">4</w:t>
             </w:r>
           </w:p>
         </w:tc>
@@ -5654,7 +6198,7 @@
           </w:tcPr>
           <w:p>
             <w:r>
-              <w:t xml:space="preserve">Inicio</w:t>
+              <w:t xml:space="preserve">Sala 1</w:t>
             </w:r>
           </w:p>
         </w:tc>
@@ -5676,7 +6220,7 @@
           </w:tcPr>
           <w:p>
             <w:r>
-              <w:t xml:space="preserve">Tienes cinco minutos para reparar cada sistema. Si se acaba el tiempo, pasaremos al siguiente. ¡Adelante, astronauta!</w:t>
+              <w:t xml:space="preserve">La puerta está cerrada. Guía a Roki, el robot, hasta el botón verde para abrirla.</w:t>
             </w:r>
           </w:p>
         </w:tc>
@@ -5700,7 +6244,7 @@
           </w:tcPr>
           <w:p>
             <w:r>
-              <w:t xml:space="preserve">4</w:t>
+              <w:t xml:space="preserve">6</w:t>
             </w:r>
           </w:p>
         </w:tc>
@@ -5744,7 +6288,7 @@
           </w:tcPr>
           <w:p>
             <w:r>
-              <w:t xml:space="preserve">La puerta de tu habitación está cerrada. Para abrirla, debemos presionar el botón verde que está al otro lado de la habitación.</w:t>
+              <w:t xml:space="preserve">Ordena los bloques de la mesa y presiona el botón azul.</w:t>
             </w:r>
           </w:p>
         </w:tc>
@@ -5768,7 +6312,7 @@
           </w:tcPr>
           <w:p>
             <w:r>
-              <w:t xml:space="preserve">5</w:t>
+              <w:t xml:space="preserve">7</w:t>
             </w:r>
           </w:p>
         </w:tc>
@@ -5790,7 +6334,7 @@
           </w:tcPr>
           <w:p>
             <w:r>
-              <w:t xml:space="preserve">Sala 1</w:t>
+              <w:t xml:space="preserve">Sala 1 · fin</w:t>
             </w:r>
           </w:p>
         </w:tc>
@@ -5812,7 +6356,7 @@
           </w:tcPr>
           <w:p>
             <w:r>
-              <w:t xml:space="preserve">Roki, el robot de mantenimiento te ayudará. Puedes verlo a la derecha. Guíalo hasta el botón verde.</w:t>
+              <w:t xml:space="preserve">¡Muy bien! La puerta está abierta.</w:t>
             </w:r>
           </w:p>
         </w:tc>
@@ -5836,7 +6380,7 @@
           </w:tcPr>
           <w:p>
             <w:r>
-              <w:t xml:space="preserve">6</w:t>
+              <w:t xml:space="preserve">8</w:t>
             </w:r>
           </w:p>
         </w:tc>
@@ -5858,7 +6402,7 @@
           </w:tcPr>
           <w:p>
             <w:r>
-              <w:t xml:space="preserve">Sala 1</w:t>
+              <w:t xml:space="preserve">Sala 2</w:t>
             </w:r>
           </w:p>
         </w:tc>
@@ -5880,7 +6424,7 @@
           </w:tcPr>
           <w:p>
             <w:r>
-              <w:t xml:space="preserve">Ordena los bloques de la mesa para crear su recorrido. Cuando termines, inicia la secuencia.</w:t>
+              <w:t xml:space="preserve">Has llegado a la sala de control. La tormenta dañó la configuración de varios sistemas.</w:t>
             </w:r>
           </w:p>
         </w:tc>
@@ -5904,7 +6448,7 @@
           </w:tcPr>
           <w:p>
             <w:r>
-              <w:t xml:space="preserve">7</w:t>
+              <w:t xml:space="preserve">9.1</w:t>
             </w:r>
           </w:p>
         </w:tc>
@@ -5926,7 +6470,7 @@
           </w:tcPr>
           <w:p>
             <w:r>
-              <w:t xml:space="preserve">Sala 1 · fin</w:t>
+              <w:t xml:space="preserve">Sala 2 · básica</w:t>
             </w:r>
           </w:p>
         </w:tc>
@@ -5948,7 +6492,7 @@
           </w:tcPr>
           <w:p>
             <w:r>
-              <w:t xml:space="preserve">¡Muy bien, astronauta! Roki llegó al botón y la puerta está abierta. Puedes continuar.</w:t>
+              <w:t xml:space="preserve">Cada sistema necesita un elemento para volver a funcionar. Observa las opciones y elige el correcto para cada uno.</w:t>
             </w:r>
           </w:p>
         </w:tc>
@@ -5972,7 +6516,7 @@
           </w:tcPr>
           <w:p>
             <w:r>
-              <w:t xml:space="preserve">8</w:t>
+              <w:t xml:space="preserve">9.2</w:t>
             </w:r>
           </w:p>
         </w:tc>
@@ -5994,7 +6538,7 @@
           </w:tcPr>
           <w:p>
             <w:r>
-              <w:t xml:space="preserve">Sala 2</w:t>
+              <w:t xml:space="preserve">Sala 2 · intermedia</w:t>
             </w:r>
           </w:p>
         </w:tc>
@@ -6016,7 +6560,7 @@
           </w:tcPr>
           <w:p>
             <w:r>
-              <w:t xml:space="preserve">Has llegado a la sala de control. La tormenta dañó la configuración de varios sistemas.</w:t>
+              <w:t xml:space="preserve">Cada sistema necesita varios elementos para volver a funcionar. Observa las opciones y selecciona todos los elementos correctos para cada uno.</w:t>
             </w:r>
           </w:p>
         </w:tc>
@@ -6040,7 +6584,7 @@
           </w:tcPr>
           <w:p>
             <w:r>
-              <w:t xml:space="preserve">9.1</w:t>
+              <w:t xml:space="preserve">10</w:t>
             </w:r>
           </w:p>
         </w:tc>
@@ -6062,7 +6606,7 @@
           </w:tcPr>
           <w:p>
             <w:r>
-              <w:t xml:space="preserve">Sala 2 · básica</w:t>
+              <w:t xml:space="preserve">Sala 2 · fin</w:t>
             </w:r>
           </w:p>
         </w:tc>
@@ -6084,7 +6628,7 @@
           </w:tcPr>
           <w:p>
             <w:r>
-              <w:t xml:space="preserve">Cada sistema necesita un elemento para volver a funcionar. Observa las opciones y elige el correcto para cada uno.</w:t>
+              <w:t xml:space="preserve">¡Excelente elección! Los sistemas vuelven a funcionar correctamente. La nave está cada vez más cerca de continuar su viaje.</w:t>
             </w:r>
           </w:p>
         </w:tc>
@@ -6108,7 +6652,7 @@
           </w:tcPr>
           <w:p>
             <w:r>
-              <w:t xml:space="preserve">9.2</w:t>
+              <w:t xml:space="preserve">11</w:t>
             </w:r>
           </w:p>
         </w:tc>
@@ -6130,7 +6674,7 @@
           </w:tcPr>
           <w:p>
             <w:r>
-              <w:t xml:space="preserve">Sala 2 · intermedia</w:t>
+              <w:t xml:space="preserve">Sala 3</w:t>
             </w:r>
           </w:p>
         </w:tc>
@@ -6152,7 +6696,7 @@
           </w:tcPr>
           <w:p>
             <w:r>
-              <w:t xml:space="preserve">Cada sistema necesita varios elementos para volver a funcionar. Observa las opciones y selecciona todos los elementos correctos para cada uno.</w:t>
+              <w:t xml:space="preserve">Estas cajas están bloqueando el camino. Usa el brazo robótico para colocarlas en el lugar correcto.</w:t>
             </w:r>
           </w:p>
         </w:tc>
@@ -6176,7 +6720,7 @@
           </w:tcPr>
           <w:p>
             <w:r>
-              <w:t xml:space="preserve">10</w:t>
+              <w:t xml:space="preserve">12</w:t>
             </w:r>
           </w:p>
         </w:tc>
@@ -6198,7 +6742,7 @@
           </w:tcPr>
           <w:p>
             <w:r>
-              <w:t xml:space="preserve">Sala 2 · fin</w:t>
+              <w:t xml:space="preserve">Sala 3</w:t>
             </w:r>
           </w:p>
         </w:tc>
@@ -6220,7 +6764,7 @@
           </w:tcPr>
           <w:p>
             <w:r>
-              <w:t xml:space="preserve">¡Excelente elección! Los sistemas vuelven a funcionar correctamente. La nave está cada vez más cerca de continuar su viaje.</w:t>
+              <w:t xml:space="preserve">Fíjate en el color: los barriles rojos van a tu izquierda y las cajas celestes, a tu derecha.</w:t>
             </w:r>
           </w:p>
         </w:tc>
@@ -6244,7 +6788,7 @@
           </w:tcPr>
           <w:p>
             <w:r>
-              <w:t xml:space="preserve">11</w:t>
+              <w:t xml:space="preserve">13</w:t>
             </w:r>
           </w:p>
         </w:tc>
@@ -6288,7 +6832,7 @@
           </w:tcPr>
           <w:p>
             <w:r>
-              <w:t xml:space="preserve">Estas cajas están bloqueando el camino. Usa el brazo robótico para colocarlas en el lugar correcto.</w:t>
+              <w:t xml:space="preserve">Puedes ver dos fichas de colores celeste y rojo, elige una y colócala en la casilla. Así, el brazo sabrá qué debe mover.</w:t>
             </w:r>
           </w:p>
         </w:tc>
@@ -6312,7 +6856,7 @@
           </w:tcPr>
           <w:p>
             <w:r>
-              <w:t xml:space="preserve">12</w:t>
+              <w:t xml:space="preserve">14.1</w:t>
             </w:r>
           </w:p>
         </w:tc>
@@ -6334,7 +6878,7 @@
           </w:tcPr>
           <w:p>
             <w:r>
-              <w:t xml:space="preserve">Sala 3</w:t>
+              <w:t xml:space="preserve">Sala 3 · básica</w:t>
             </w:r>
           </w:p>
         </w:tc>
@@ -6356,7 +6900,7 @@
           </w:tcPr>
           <w:p>
             <w:r>
-              <w:t xml:space="preserve">Fíjate en el color de las cajas y observa dónde debe ir cada una.</w:t>
+              <w:t xml:space="preserve">Cuenta las cajas de ese color e indica cuántas veces debe repetir la acción. Después, haz lo mismo con el otro color.</w:t>
             </w:r>
           </w:p>
         </w:tc>
@@ -6380,7 +6924,7 @@
           </w:tcPr>
           <w:p>
             <w:r>
-              <w:t xml:space="preserve">13</w:t>
+              <w:t xml:space="preserve">14.2</w:t>
             </w:r>
           </w:p>
         </w:tc>
@@ -6402,7 +6946,7 @@
           </w:tcPr>
           <w:p>
             <w:r>
-              <w:t xml:space="preserve">Sala 3</w:t>
+              <w:t xml:space="preserve">Sala 3 · intermedia</w:t>
             </w:r>
           </w:p>
         </w:tc>
@@ -6424,7 +6968,7 @@
           </w:tcPr>
           <w:p>
             <w:r>
-              <w:t xml:space="preserve">Puedes ver dos fichas de colores celeste y rojo, elige una y colócala en la casilla. Así, el brazo sabrá qué debe mover.</w:t>
+              <w:t xml:space="preserve">Ordena los bloques de acción para indicarle qué debe hacer con las cajas de ese color. Después, indica cuántas veces debe repetir la secuencia. Cuando termines, haz lo mismo con el otro color.</w:t>
             </w:r>
           </w:p>
         </w:tc>
@@ -6448,7 +6992,7 @@
           </w:tcPr>
           <w:p>
             <w:r>
-              <w:t xml:space="preserve">14.1</w:t>
+              <w:t xml:space="preserve">15</w:t>
             </w:r>
           </w:p>
         </w:tc>
@@ -6470,7 +7014,7 @@
           </w:tcPr>
           <w:p>
             <w:r>
-              <w:t xml:space="preserve">Sala 3 · básica</w:t>
+              <w:t xml:space="preserve">Sala 3 · fin</w:t>
             </w:r>
           </w:p>
         </w:tc>
@@ -6492,7 +7036,7 @@
           </w:tcPr>
           <w:p>
             <w:r>
-              <w:t xml:space="preserve">Cuenta las cajas de ese color e indica cuántas veces debe repetir la acción. Después, haz lo mismo con el otro color.</w:t>
+              <w:t xml:space="preserve">¡Muy bien, astronauta! Todas las cajas están en su lugar y el camino quedó despejado.</w:t>
             </w:r>
           </w:p>
         </w:tc>
@@ -6516,7 +7060,7 @@
           </w:tcPr>
           <w:p>
             <w:r>
-              <w:t xml:space="preserve">14.2</w:t>
+              <w:t xml:space="preserve">16</w:t>
             </w:r>
           </w:p>
         </w:tc>
@@ -6538,7 +7082,7 @@
           </w:tcPr>
           <w:p>
             <w:r>
-              <w:t xml:space="preserve">Sala 3 · intermedia</w:t>
+              <w:t xml:space="preserve">Sala 4</w:t>
             </w:r>
           </w:p>
         </w:tc>
@@ -6560,7 +7104,7 @@
           </w:tcPr>
           <w:p>
             <w:r>
-              <w:t xml:space="preserve">Ordena los bloques de acción para indicarle qué debe hacer con las cajas de ese color. Después, indica cuántas veces debe repetir la secuencia. Cuando termines, haz lo mismo con el otro color.</w:t>
+              <w:t xml:space="preserve">Llegamos a la última sala. En esta sala te encargarás de encender la nave. Presta atención a cómo se hace.</w:t>
             </w:r>
           </w:p>
         </w:tc>
@@ -6584,7 +7128,7 @@
           </w:tcPr>
           <w:p>
             <w:r>
-              <w:t xml:space="preserve">15</w:t>
+              <w:t xml:space="preserve">17</w:t>
             </w:r>
           </w:p>
         </w:tc>
@@ -6606,7 +7150,7 @@
           </w:tcPr>
           <w:p>
             <w:r>
-              <w:t xml:space="preserve">Sala 3 · fin</w:t>
+              <w:t xml:space="preserve">Sala 4</w:t>
             </w:r>
           </w:p>
         </w:tc>
@@ -6628,7 +7172,7 @@
           </w:tcPr>
           <w:p>
             <w:r>
-              <w:t xml:space="preserve">¡Muy bien, astronauta! Todas las cajas están en su lugar y el camino quedó despejado.</w:t>
+              <w:t xml:space="preserve">Observa las figuras del panel y arrastra cada bloque hasta el espacio que tenga la misma figura.</w:t>
             </w:r>
           </w:p>
         </w:tc>
@@ -6652,7 +7196,7 @@
           </w:tcPr>
           <w:p>
             <w:r>
-              <w:t xml:space="preserve">16</w:t>
+              <w:t xml:space="preserve">18</w:t>
             </w:r>
           </w:p>
         </w:tc>
@@ -6674,7 +7218,7 @@
           </w:tcPr>
           <w:p>
             <w:r>
-              <w:t xml:space="preserve">Sala 4</w:t>
+              <w:t xml:space="preserve">Sala 4 · fin</w:t>
             </w:r>
           </w:p>
         </w:tc>
@@ -6696,7 +7240,7 @@
           </w:tcPr>
           <w:p>
             <w:r>
-              <w:t xml:space="preserve">Llegamos a la última sala. En esta sala te encargarás de encender la nave. Presta atención a cómo se hace.</w:t>
+              <w:t xml:space="preserve">¿Escuchas eso, astronauta? ¡Los motores están encendidos y todos los sistemas funcionan correctamente!</w:t>
             </w:r>
           </w:p>
         </w:tc>
@@ -6720,7 +7264,7 @@
           </w:tcPr>
           <w:p>
             <w:r>
-              <w:t xml:space="preserve">17</w:t>
+              <w:t xml:space="preserve">19</w:t>
             </w:r>
           </w:p>
         </w:tc>
@@ -6742,7 +7286,7 @@
           </w:tcPr>
           <w:p>
             <w:r>
-              <w:t xml:space="preserve">Sala 4</w:t>
+              <w:t xml:space="preserve">Final</w:t>
             </w:r>
           </w:p>
         </w:tc>
@@ -6764,7 +7308,7 @@
           </w:tcPr>
           <w:p>
             <w:r>
-              <w:t xml:space="preserve">Observa las figuras del panel y arrastra cada bloque hasta el espacio que tenga la misma figura.</w:t>
+              <w:t xml:space="preserve">¡Misión cumplida! La nave puede continuar su viaje de regreso a la Tierra. ¡Excelente trabajo!</w:t>
             </w:r>
           </w:p>
         </w:tc>
@@ -6788,7 +7332,7 @@
           </w:tcPr>
           <w:p>
             <w:r>
-              <w:t xml:space="preserve">18</w:t>
+              <w:t xml:space="preserve">20</w:t>
             </w:r>
           </w:p>
         </w:tc>
@@ -6810,7 +7354,7 @@
           </w:tcPr>
           <w:p>
             <w:r>
-              <w:t xml:space="preserve">Sala 4 · fin</w:t>
+              <w:t xml:space="preserve">Tiempo de la sesión agotado, o el de la última sala</w:t>
             </w:r>
           </w:p>
         </w:tc>
@@ -6832,7 +7376,7 @@
           </w:tcPr>
           <w:p>
             <w:r>
-              <w:t xml:space="preserve">¿Escuchas eso, astronauta? ¡Los motores están encendidos y todos los sistemas funcionan correctamente!</w:t>
+              <w:t xml:space="preserve">¡Oh, no! El tiempo ha terminado. No logramos completar la misión, pero hiciste un gran trabajo hasta aquí. ¡Gracias por intentarlo!</w:t>
             </w:r>
           </w:p>
         </w:tc>
@@ -6856,7 +7400,7 @@
           </w:tcPr>
           <w:p>
             <w:r>
-              <w:t xml:space="preserve">19</w:t>
+              <w:t xml:space="preserve">21</w:t>
             </w:r>
           </w:p>
         </w:tc>
@@ -6878,7 +7422,7 @@
           </w:tcPr>
           <w:p>
             <w:r>
-              <w:t xml:space="preserve">Final</w:t>
+              <w:t xml:space="preserve">Tiempo agotado en una sala</w:t>
             </w:r>
           </w:p>
         </w:tc>
@@ -6900,142 +7444,6 @@
           </w:tcPr>
           <w:p>
             <w:r>
-              <w:t xml:space="preserve">¡Misión cumplida! La nave puede continuar su viaje de regreso a la Tierra. ¡Excelente trabajo!</w:t>
-            </w:r>
-          </w:p>
-        </w:tc>
-      </w:tr>
-      <w:tr>
-        <w:tc>
-          <w:tcPr>
-            <w:tcW w:type="dxa" w:w="800"/>
-            <w:tcBorders>
-              <w:top w:val="single" w:color="B4B4B4" w:sz="4"/>
-              <w:left w:val="single" w:color="B4B4B4" w:sz="4"/>
-              <w:bottom w:val="single" w:color="B4B4B4" w:sz="4"/>
-              <w:right w:val="single" w:color="B4B4B4" w:sz="4"/>
-            </w:tcBorders>
-            <w:tcMar>
-              <w:top w:type="dxa" w:w="60"/>
-              <w:left w:type="dxa" w:w="100"/>
-              <w:bottom w:type="dxa" w:w="60"/>
-              <w:right w:type="dxa" w:w="100"/>
-            </w:tcMar>
-          </w:tcPr>
-          <w:p>
-            <w:r>
-              <w:t xml:space="preserve">20</w:t>
-            </w:r>
-          </w:p>
-        </w:tc>
-        <w:tc>
-          <w:tcPr>
-            <w:tcW w:type="dxa" w:w="2000"/>
-            <w:tcBorders>
-              <w:top w:val="single" w:color="B4B4B4" w:sz="4"/>
-              <w:left w:val="single" w:color="B4B4B4" w:sz="4"/>
-              <w:bottom w:val="single" w:color="B4B4B4" w:sz="4"/>
-              <w:right w:val="single" w:color="B4B4B4" w:sz="4"/>
-            </w:tcBorders>
-            <w:tcMar>
-              <w:top w:type="dxa" w:w="60"/>
-              <w:left w:type="dxa" w:w="100"/>
-              <w:bottom w:type="dxa" w:w="60"/>
-              <w:right w:type="dxa" w:w="100"/>
-            </w:tcMar>
-          </w:tcPr>
-          <w:p>
-            <w:r>
-              <w:t xml:space="preserve">Tiempo de la sesión agotado, o el de la última sala</w:t>
-            </w:r>
-          </w:p>
-        </w:tc>
-        <w:tc>
-          <w:tcPr>
-            <w:tcW w:type="dxa" w:w="6838"/>
-            <w:tcBorders>
-              <w:top w:val="single" w:color="B4B4B4" w:sz="4"/>
-              <w:left w:val="single" w:color="B4B4B4" w:sz="4"/>
-              <w:bottom w:val="single" w:color="B4B4B4" w:sz="4"/>
-              <w:right w:val="single" w:color="B4B4B4" w:sz="4"/>
-            </w:tcBorders>
-            <w:tcMar>
-              <w:top w:type="dxa" w:w="60"/>
-              <w:left w:type="dxa" w:w="100"/>
-              <w:bottom w:type="dxa" w:w="60"/>
-              <w:right w:type="dxa" w:w="100"/>
-            </w:tcMar>
-          </w:tcPr>
-          <w:p>
-            <w:r>
-              <w:t xml:space="preserve">¡Oh, no! El tiempo ha terminado. No logramos completar la misión, pero hiciste un gran trabajo hasta aquí. ¡Gracias por intentarlo!</w:t>
-            </w:r>
-          </w:p>
-        </w:tc>
-      </w:tr>
-      <w:tr>
-        <w:tc>
-          <w:tcPr>
-            <w:tcW w:type="dxa" w:w="800"/>
-            <w:tcBorders>
-              <w:top w:val="single" w:color="B4B4B4" w:sz="4"/>
-              <w:left w:val="single" w:color="B4B4B4" w:sz="4"/>
-              <w:bottom w:val="single" w:color="B4B4B4" w:sz="4"/>
-              <w:right w:val="single" w:color="B4B4B4" w:sz="4"/>
-            </w:tcBorders>
-            <w:tcMar>
-              <w:top w:type="dxa" w:w="60"/>
-              <w:left w:type="dxa" w:w="100"/>
-              <w:bottom w:type="dxa" w:w="60"/>
-              <w:right w:type="dxa" w:w="100"/>
-            </w:tcMar>
-          </w:tcPr>
-          <w:p>
-            <w:r>
-              <w:t xml:space="preserve">21</w:t>
-            </w:r>
-          </w:p>
-        </w:tc>
-        <w:tc>
-          <w:tcPr>
-            <w:tcW w:type="dxa" w:w="2000"/>
-            <w:tcBorders>
-              <w:top w:val="single" w:color="B4B4B4" w:sz="4"/>
-              <w:left w:val="single" w:color="B4B4B4" w:sz="4"/>
-              <w:bottom w:val="single" w:color="B4B4B4" w:sz="4"/>
-              <w:right w:val="single" w:color="B4B4B4" w:sz="4"/>
-            </w:tcBorders>
-            <w:tcMar>
-              <w:top w:type="dxa" w:w="60"/>
-              <w:left w:type="dxa" w:w="100"/>
-              <w:bottom w:type="dxa" w:w="60"/>
-              <w:right w:type="dxa" w:w="100"/>
-            </w:tcMar>
-          </w:tcPr>
-          <w:p>
-            <w:r>
-              <w:t xml:space="preserve">Tiempo agotado en una sala</w:t>
-            </w:r>
-          </w:p>
-        </w:tc>
-        <w:tc>
-          <w:tcPr>
-            <w:tcW w:type="dxa" w:w="6838"/>
-            <w:tcBorders>
-              <w:top w:val="single" w:color="B4B4B4" w:sz="4"/>
-              <w:left w:val="single" w:color="B4B4B4" w:sz="4"/>
-              <w:bottom w:val="single" w:color="B4B4B4" w:sz="4"/>
-              <w:right w:val="single" w:color="B4B4B4" w:sz="4"/>
-            </w:tcBorders>
-            <w:tcMar>
-              <w:top w:type="dxa" w:w="60"/>
-              <w:left w:type="dxa" w:w="100"/>
-              <w:bottom w:type="dxa" w:w="60"/>
-              <w:right w:type="dxa" w:w="100"/>
-            </w:tcMar>
-          </w:tcPr>
-          <w:p>
-            <w:r>
               <w:t xml:space="preserve">¡Se acabó el tiempo en esta sala! No te preocupes, astronauta: sigamos con la siguiente.</w:t>
             </w:r>
           </w:p>
@@ -7046,9 +7454,11 @@
       <w:pPr>
         <w:pStyle w:val="Heading1"/>
       </w:pPr>
+      <w:bookmarkStart w:name="_Toc21" w:id="21"/>
       <w:r>
         <w:t xml:space="preserve">8. Resumen de dificultades</w:t>
       </w:r>
+      <w:bookmarkEnd w:id="21"/>
     </w:p>
     <w:tbl>
       <w:tblPr>
@@ -7430,9 +7840,11 @@
       <w:pPr>
         <w:pStyle w:val="Heading1"/>
       </w:pPr>
+      <w:bookmarkStart w:name="_Toc22" w:id="22"/>
       <w:r>
         <w:t xml:space="preserve">9. Registro de datos</w:t>
       </w:r>
+      <w:bookmarkEnd w:id="22"/>
     </w:p>
     <w:p>
       <w:pPr>
@@ -7765,9 +8177,11 @@
       <w:pPr>
         <w:pStyle w:val="Heading1"/>
       </w:pPr>
+      <w:bookmarkStart w:name="_Toc23" w:id="23"/>
       <w:r>
         <w:t xml:space="preserve">10. Fuera de alcance</w:t>
       </w:r>
+      <w:bookmarkEnd w:id="23"/>
     </w:p>
     <w:p>
       <w:pPr>
@@ -7877,8 +8291,29 @@
         <w:szCs w:val="18"/>
       </w:rPr>
       <w:fldChar w:fldCharType="begin"/>
+    </w:r>
+    <w:r>
+      <w:rPr>
+        <w:color w:val="7F7F7F"/>
+        <w:sz w:val="18"/>
+        <w:szCs w:val="18"/>
+      </w:rPr>
       <w:instrText xml:space="preserve">PAGE</w:instrText>
+    </w:r>
+    <w:r>
+      <w:rPr>
+        <w:color w:val="7F7F7F"/>
+        <w:sz w:val="18"/>
+        <w:szCs w:val="18"/>
+      </w:rPr>
       <w:fldChar w:fldCharType="separate"/>
+    </w:r>
+    <w:r>
+      <w:rPr>
+        <w:color w:val="7F7F7F"/>
+        <w:sz w:val="18"/>
+        <w:szCs w:val="18"/>
+      </w:rPr>
       <w:fldChar w:fldCharType="end"/>
     </w:r>
   </w:p>
@@ -8068,6 +8503,21 @@
   <w:style w:type="paragraph" w:styleId="Normal" w:default="1">
     <w:name w:val="Normal"/>
     <w:qFormat/>
+  </w:style>
+  <w:style w:type="table" w:styleId="TableNormal" w:default="true">
+    <w:name w:val="Normal Table"/>
+    <w:uiPriority w:val="99"/>
+    <w:semiHidden/>
+    <w:unhideWhenUsed/>
+    <w:tblPr>
+      <w:tblInd w:type="dxa" w:w="0"/>
+      <w:tblCellMar>
+        <w:top w:type="dxa" w:w="0"/>
+        <w:left w:type="dxa" w:w="108"/>
+        <w:bottom w:type="dxa" w:w="0"/>
+        <w:right w:type="dxa" w:w="108"/>
+      </w:tblCellMar>
+    </w:tblPr>
   </w:style>
   <w:style w:type="paragraph" w:styleId="Title">
     <w:name w:val="Title"/>
@@ -8122,6 +8572,139 @@
     <w:name w:val="List Paragraph"/>
     <w:basedOn w:val="Normal"/>
     <w:qFormat/>
+  </w:style>
+  <w:style w:type="paragraph" w:styleId="Caption">
+    <w:name w:val="caption"/>
+    <w:basedOn w:val="Normal"/>
+    <w:next w:val="Normal"/>
+    <w:uiPriority w:val="35"/>
+    <w:semiHidden/>
+    <w:unhideWhenUsed/>
+    <w:qFormat/>
+    <w:pPr>
+      <w:spacing w:after="200"/>
+    </w:pPr>
+    <w:rPr>
+      <w:i/>
+      <w:iCs/>
+      <w:color w:val="44546A" w:themeColor="dark2"/>
+      <w:sz w:val="18"/>
+      <w:szCs w:val="18"/>
+    </w:rPr>
+  </w:style>
+  <w:style w:type="paragraph" w:styleId="Bibliography">
+    <w:name w:val="Bibliography"/>
+    <w:basedOn w:val="Normal"/>
+    <w:next w:val="Normal"/>
+    <w:uiPriority w:val="37"/>
+    <w:unhideWhenUsed/>
+  </w:style>
+  <w:style w:type="paragraph" w:styleId="TOC1">
+    <w:name w:val="toc 1"/>
+    <w:basedOn w:val="Normal"/>
+    <w:next w:val="Normal"/>
+    <w:uiPriority w:val="39"/>
+    <w:semiHidden/>
+    <w:unhideWhenUsed/>
+    <w:pPr>
+      <w:spacing w:after="100"/>
+    </w:pPr>
+  </w:style>
+  <w:style w:type="paragraph" w:styleId="TOC2">
+    <w:name w:val="toc 2"/>
+    <w:basedOn w:val="Normal"/>
+    <w:next w:val="Normal"/>
+    <w:uiPriority w:val="39"/>
+    <w:semiHidden/>
+    <w:unhideWhenUsed/>
+    <w:pPr>
+      <w:spacing w:after="100"/>
+      <w:ind w:left="220"/>
+    </w:pPr>
+  </w:style>
+  <w:style w:type="paragraph" w:styleId="TOC3">
+    <w:name w:val="toc 3"/>
+    <w:basedOn w:val="Normal"/>
+    <w:next w:val="Normal"/>
+    <w:uiPriority w:val="39"/>
+    <w:semiHidden/>
+    <w:unhideWhenUsed/>
+    <w:pPr>
+      <w:spacing w:after="100"/>
+      <w:ind w:left="440"/>
+    </w:pPr>
+  </w:style>
+  <w:style w:type="paragraph" w:styleId="TOC4">
+    <w:name w:val="toc 4"/>
+    <w:basedOn w:val="Normal"/>
+    <w:next w:val="Normal"/>
+    <w:uiPriority w:val="39"/>
+    <w:semiHidden/>
+    <w:unhideWhenUsed/>
+    <w:pPr>
+      <w:spacing w:after="100"/>
+      <w:ind w:left="660"/>
+    </w:pPr>
+  </w:style>
+  <w:style w:type="paragraph" w:styleId="TOC5">
+    <w:name w:val="toc 5"/>
+    <w:basedOn w:val="Normal"/>
+    <w:next w:val="Normal"/>
+    <w:uiPriority w:val="39"/>
+    <w:semiHidden/>
+    <w:unhideWhenUsed/>
+    <w:pPr>
+      <w:spacing w:after="100"/>
+      <w:ind w:left="880"/>
+    </w:pPr>
+  </w:style>
+  <w:style w:type="paragraph" w:styleId="TOC6">
+    <w:name w:val="toc 6"/>
+    <w:basedOn w:val="Normal"/>
+    <w:next w:val="Normal"/>
+    <w:uiPriority w:val="39"/>
+    <w:semiHidden/>
+    <w:unhideWhenUsed/>
+    <w:pPr>
+      <w:spacing w:after="100"/>
+      <w:ind w:left="1100"/>
+    </w:pPr>
+  </w:style>
+  <w:style w:type="paragraph" w:styleId="TOC7">
+    <w:name w:val="toc 7"/>
+    <w:basedOn w:val="Normal"/>
+    <w:next w:val="Normal"/>
+    <w:uiPriority w:val="39"/>
+    <w:semiHidden/>
+    <w:unhideWhenUsed/>
+    <w:pPr>
+      <w:spacing w:after="100"/>
+      <w:ind w:left="1320"/>
+    </w:pPr>
+  </w:style>
+  <w:style w:type="paragraph" w:styleId="TOC8">
+    <w:name w:val="toc 8"/>
+    <w:basedOn w:val="Normal"/>
+    <w:next w:val="Normal"/>
+    <w:uiPriority w:val="39"/>
+    <w:semiHidden/>
+    <w:unhideWhenUsed/>
+    <w:pPr>
+      <w:spacing w:after="100"/>
+      <w:ind w:left="1540"/>
+    </w:pPr>
+  </w:style>
+  <w:style w:type="paragraph" w:styleId="TOC9">
+    <w:name w:val="toc 9"/>
+    <w:basedOn w:val="Normal"/>
+    <w:next w:val="Normal"/>
+    <w:uiPriority w:val="39"/>
+    <w:semiHidden/>
+    <w:unhideWhenUsed/>
+    <w:pPr>
+      <w:spacing w:after="100"/>
+      <w:ind w:left="1760"/>
+    </w:pPr>
   </w:style>
   <w:style w:type="character" w:styleId="Hyperlink">
     <w:name w:val="Hyperlink"/>
@@ -8206,6 +8789,13 @@
       <w:sz w:val="20"/>
       <w:szCs w:val="20"/>
     </w:rPr>
+  </w:style>
+  <w:style w:type="character" w:styleId="LineNumber">
+    <w:name w:val="line number"/>
+    <w:basedOn w:val="DefaultParagraphFont"/>
+    <w:uiPriority w:val="99"/>
+    <w:semiHidden/>
+    <w:unhideWhenUsed/>
   </w:style>
   <w:style w:type="paragraph" w:styleId="Heading1">
     <w:name w:val="Heading 1"/>

</xml_diff>